<commit_message>
update documentation and readme
</commit_message>
<xml_diff>
--- a/docs/pseudo_readthedocs_temperature.docx
+++ b/docs/pseudo_readthedocs_temperature.docx
@@ -247,6 +247,7 @@
                 <w:lang w:val="en"/>
               </w:rPr>
             </w:pPr>
+            <w:proofErr w:type="spellStart"/>
             <w:r>
               <w:rPr>
                 <w:bCs/>
@@ -265,40 +266,9 @@
                 <w:color w:val="2E74B5" w:themeColor="accent5" w:themeShade="BF"/>
                 <w:lang w:val="en"/>
               </w:rPr>
-              <w:t xml:space="preserve">class </w:t>
-            </w:r>
-            <w:r>
-              <w:rPr>
-                <w:bCs/>
-                <w:iCs/>
-                <w:lang w:val="en"/>
-              </w:rPr>
-              <w:t>temperature</w:t>
-            </w:r>
-            <w:r>
-              <w:rPr>
-                <w:bCs/>
-                <w:iCs/>
-                <w:lang w:val="en"/>
-              </w:rPr>
-              <w:t>.</w:t>
-            </w:r>
-            <w:r>
-              <w:rPr>
-                <w:bCs/>
-                <w:iCs/>
-                <w:lang w:val="en"/>
-              </w:rPr>
-              <w:t>celsius_to_fahrenheit</w:t>
-            </w:r>
-            <w:r>
-              <w:rPr>
-                <w:bCs/>
-                <w:color w:val="2E74B5" w:themeColor="accent5" w:themeShade="BF"/>
-                <w:lang w:val="en"/>
-              </w:rPr>
-              <w:t>(</w:t>
-            </w:r>
+              <w:t>class</w:t>
+            </w:r>
+            <w:proofErr w:type="spellEnd"/>
             <w:r>
               <w:rPr>
                 <w:bCs/>
@@ -307,8 +277,64 @@
                 <w:color w:val="2E74B5" w:themeColor="accent5" w:themeShade="BF"/>
                 <w:lang w:val="en"/>
               </w:rPr>
+              <w:t xml:space="preserve"> </w:t>
+            </w:r>
+            <w:proofErr w:type="spellStart"/>
+            <w:proofErr w:type="gramStart"/>
+            <w:r>
+              <w:rPr>
+                <w:bCs/>
+                <w:iCs/>
+                <w:lang w:val="en"/>
+              </w:rPr>
+              <w:t>temperature</w:t>
+            </w:r>
+            <w:r>
+              <w:rPr>
+                <w:bCs/>
+                <w:iCs/>
+                <w:lang w:val="en"/>
+              </w:rPr>
+              <w:t>.</w:t>
+            </w:r>
+            <w:r>
+              <w:rPr>
+                <w:bCs/>
+                <w:iCs/>
+                <w:lang w:val="en"/>
+              </w:rPr>
+              <w:t>celsius</w:t>
+            </w:r>
+            <w:proofErr w:type="gramEnd"/>
+            <w:r>
+              <w:rPr>
+                <w:bCs/>
+                <w:iCs/>
+                <w:lang w:val="en"/>
+              </w:rPr>
+              <w:t>_to_fahrenheit</w:t>
+            </w:r>
+            <w:proofErr w:type="spellEnd"/>
+            <w:r>
+              <w:rPr>
+                <w:bCs/>
+                <w:color w:val="2E74B5" w:themeColor="accent5" w:themeShade="BF"/>
+                <w:lang w:val="en"/>
+              </w:rPr>
+              <w:t>(</w:t>
+            </w:r>
+            <w:proofErr w:type="spellStart"/>
+            <w:r>
+              <w:rPr>
+                <w:bCs/>
+                <w:i/>
+                <w:iCs/>
+                <w:color w:val="2E74B5" w:themeColor="accent5" w:themeShade="BF"/>
+                <w:lang w:val="en"/>
+              </w:rPr>
               <w:t>deg_c</w:t>
             </w:r>
+            <w:proofErr w:type="spellEnd"/>
             <w:r>
               <w:rPr>
                 <w:bCs/>
@@ -444,6 +470,7 @@
                 <w:numId w:val="4"/>
               </w:numPr>
             </w:pPr>
+            <w:proofErr w:type="spellStart"/>
             <w:r>
               <w:rPr>
                 <w:b/>
@@ -451,6 +478,7 @@
               </w:rPr>
               <w:t>deg_c</w:t>
             </w:r>
+            <w:proofErr w:type="spellEnd"/>
             <w:r>
               <w:t xml:space="preserve"> – </w:t>
             </w:r>
@@ -469,11 +497,16 @@
             <w:r>
               <w:t xml:space="preserve">integer. No default </w:t>
             </w:r>
+            <w:proofErr w:type="gramStart"/>
             <w:r>
               <w:t>valu</w:t>
             </w:r>
             <w:r>
-              <w:t>e.</w:t>
+              <w:t>e</w:t>
+            </w:r>
+            <w:proofErr w:type="gramEnd"/>
+            <w:r>
+              <w:t>.</w:t>
             </w:r>
           </w:p>
         </w:tc>
@@ -519,6 +552,7 @@
                 <w:lang w:val="en"/>
               </w:rPr>
             </w:pPr>
+            <w:proofErr w:type="spellStart"/>
             <w:r>
               <w:rPr>
                 <w:bCs/>
@@ -537,24 +571,9 @@
                 <w:color w:val="2E74B5" w:themeColor="accent5" w:themeShade="BF"/>
                 <w:lang w:val="en"/>
               </w:rPr>
-              <w:t xml:space="preserve">class </w:t>
-            </w:r>
-            <w:r>
-              <w:rPr>
-                <w:bCs/>
-                <w:iCs/>
-                <w:lang w:val="en"/>
-              </w:rPr>
-              <w:t>temperature.fahrenheit_to_celsius</w:t>
-            </w:r>
-            <w:r>
-              <w:rPr>
-                <w:bCs/>
-                <w:color w:val="2E74B5" w:themeColor="accent5" w:themeShade="BF"/>
-                <w:lang w:val="en"/>
-              </w:rPr>
-              <w:t>(</w:t>
-            </w:r>
+              <w:t>class</w:t>
+            </w:r>
+            <w:proofErr w:type="spellEnd"/>
             <w:r>
               <w:rPr>
                 <w:bCs/>
@@ -563,8 +582,48 @@
                 <w:color w:val="2E74B5" w:themeColor="accent5" w:themeShade="BF"/>
                 <w:lang w:val="en"/>
               </w:rPr>
+              <w:t xml:space="preserve"> </w:t>
+            </w:r>
+            <w:proofErr w:type="spellStart"/>
+            <w:proofErr w:type="gramStart"/>
+            <w:r>
+              <w:rPr>
+                <w:bCs/>
+                <w:iCs/>
+                <w:lang w:val="en"/>
+              </w:rPr>
+              <w:t>temperature.fahrenheit</w:t>
+            </w:r>
+            <w:proofErr w:type="gramEnd"/>
+            <w:r>
+              <w:rPr>
+                <w:bCs/>
+                <w:iCs/>
+                <w:lang w:val="en"/>
+              </w:rPr>
+              <w:t>_to_celsius</w:t>
+            </w:r>
+            <w:proofErr w:type="spellEnd"/>
+            <w:r>
+              <w:rPr>
+                <w:bCs/>
+                <w:color w:val="2E74B5" w:themeColor="accent5" w:themeShade="BF"/>
+                <w:lang w:val="en"/>
+              </w:rPr>
+              <w:t>(</w:t>
+            </w:r>
+            <w:proofErr w:type="spellStart"/>
+            <w:r>
+              <w:rPr>
+                <w:bCs/>
+                <w:i/>
+                <w:iCs/>
+                <w:color w:val="2E74B5" w:themeColor="accent5" w:themeShade="BF"/>
+                <w:lang w:val="en"/>
+              </w:rPr>
               <w:t>deg_f</w:t>
             </w:r>
+            <w:proofErr w:type="spellEnd"/>
             <w:r>
               <w:rPr>
                 <w:bCs/>
@@ -694,6 +753,7 @@
                 <w:numId w:val="4"/>
               </w:numPr>
             </w:pPr>
+            <w:proofErr w:type="spellStart"/>
             <w:r>
               <w:rPr>
                 <w:b/>
@@ -701,11 +761,20 @@
               </w:rPr>
               <w:t>deg_f</w:t>
             </w:r>
+            <w:proofErr w:type="spellEnd"/>
             <w:r>
               <w:t xml:space="preserve"> – </w:t>
             </w:r>
             <w:r>
-              <w:t>The input value. Can be any positive or negative integer. No default value.</w:t>
+              <w:t xml:space="preserve">The input value. Can be any positive or negative integer. No default </w:t>
+            </w:r>
+            <w:proofErr w:type="gramStart"/>
+            <w:r>
+              <w:t>value</w:t>
+            </w:r>
+            <w:proofErr w:type="gramEnd"/>
+            <w:r>
+              <w:t>.</w:t>
             </w:r>
           </w:p>
         </w:tc>
@@ -751,6 +820,7 @@
                 <w:lang w:val="en"/>
               </w:rPr>
             </w:pPr>
+            <w:proofErr w:type="spellStart"/>
             <w:r>
               <w:rPr>
                 <w:bCs/>
@@ -769,24 +839,9 @@
                 <w:color w:val="2E74B5" w:themeColor="accent5" w:themeShade="BF"/>
                 <w:lang w:val="en"/>
               </w:rPr>
-              <w:t xml:space="preserve">class </w:t>
-            </w:r>
-            <w:r>
-              <w:rPr>
-                <w:bCs/>
-                <w:iCs/>
-                <w:lang w:val="en"/>
-              </w:rPr>
-              <w:t>temperature.celsius_to_kelvin</w:t>
-            </w:r>
-            <w:r>
-              <w:rPr>
-                <w:bCs/>
-                <w:color w:val="2E74B5" w:themeColor="accent5" w:themeShade="BF"/>
-                <w:lang w:val="en"/>
-              </w:rPr>
-              <w:t>(</w:t>
-            </w:r>
+              <w:t>class</w:t>
+            </w:r>
+            <w:proofErr w:type="spellEnd"/>
             <w:r>
               <w:rPr>
                 <w:bCs/>
@@ -795,8 +850,48 @@
                 <w:color w:val="2E74B5" w:themeColor="accent5" w:themeShade="BF"/>
                 <w:lang w:val="en"/>
               </w:rPr>
+              <w:t xml:space="preserve"> </w:t>
+            </w:r>
+            <w:proofErr w:type="spellStart"/>
+            <w:proofErr w:type="gramStart"/>
+            <w:r>
+              <w:rPr>
+                <w:bCs/>
+                <w:iCs/>
+                <w:lang w:val="en"/>
+              </w:rPr>
+              <w:t>temperature.celsius</w:t>
+            </w:r>
+            <w:proofErr w:type="gramEnd"/>
+            <w:r>
+              <w:rPr>
+                <w:bCs/>
+                <w:iCs/>
+                <w:lang w:val="en"/>
+              </w:rPr>
+              <w:t>_to_kelvin</w:t>
+            </w:r>
+            <w:proofErr w:type="spellEnd"/>
+            <w:r>
+              <w:rPr>
+                <w:bCs/>
+                <w:color w:val="2E74B5" w:themeColor="accent5" w:themeShade="BF"/>
+                <w:lang w:val="en"/>
+              </w:rPr>
+              <w:t>(</w:t>
+            </w:r>
+            <w:proofErr w:type="spellStart"/>
+            <w:r>
+              <w:rPr>
+                <w:bCs/>
+                <w:i/>
+                <w:iCs/>
+                <w:color w:val="2E74B5" w:themeColor="accent5" w:themeShade="BF"/>
+                <w:lang w:val="en"/>
+              </w:rPr>
               <w:t>deg_c</w:t>
             </w:r>
+            <w:proofErr w:type="spellEnd"/>
             <w:r>
               <w:rPr>
                 <w:bCs/>
@@ -926,6 +1021,7 @@
                 <w:numId w:val="4"/>
               </w:numPr>
             </w:pPr>
+            <w:proofErr w:type="spellStart"/>
             <w:r>
               <w:rPr>
                 <w:b/>
@@ -933,11 +1029,20 @@
               </w:rPr>
               <w:t>deg_c</w:t>
             </w:r>
+            <w:proofErr w:type="spellEnd"/>
             <w:r>
               <w:t xml:space="preserve"> – </w:t>
             </w:r>
             <w:r>
-              <w:t>The input value. Can be any positive or negative integer. No default value.</w:t>
+              <w:t xml:space="preserve">The input value. Can be any positive or negative integer. No default </w:t>
+            </w:r>
+            <w:proofErr w:type="gramStart"/>
+            <w:r>
+              <w:t>value</w:t>
+            </w:r>
+            <w:proofErr w:type="gramEnd"/>
+            <w:r>
+              <w:t>.</w:t>
             </w:r>
           </w:p>
         </w:tc>
@@ -983,6 +1088,7 @@
                 <w:lang w:val="en"/>
               </w:rPr>
             </w:pPr>
+            <w:proofErr w:type="spellStart"/>
             <w:r>
               <w:rPr>
                 <w:bCs/>
@@ -1001,16 +1107,39 @@
                 <w:color w:val="2E74B5" w:themeColor="accent5" w:themeShade="BF"/>
                 <w:lang w:val="en"/>
               </w:rPr>
-              <w:t xml:space="preserve">class </w:t>
-            </w:r>
-            <w:r>
-              <w:rPr>
-                <w:bCs/>
+              <w:t>class</w:t>
+            </w:r>
+            <w:proofErr w:type="spellEnd"/>
+            <w:r>
+              <w:rPr>
+                <w:bCs/>
+                <w:i/>
                 <w:iCs/>
-                <w:lang w:val="en"/>
-              </w:rPr>
-              <w:t>temperature.kelvin_to_celsius</w:t>
-            </w:r>
+                <w:color w:val="2E74B5" w:themeColor="accent5" w:themeShade="BF"/>
+                <w:lang w:val="en"/>
+              </w:rPr>
+              <w:t xml:space="preserve"> </w:t>
+            </w:r>
+            <w:proofErr w:type="spellStart"/>
+            <w:proofErr w:type="gramStart"/>
+            <w:r>
+              <w:rPr>
+                <w:bCs/>
+                <w:iCs/>
+                <w:lang w:val="en"/>
+              </w:rPr>
+              <w:t>temperature.kelvin</w:t>
+            </w:r>
+            <w:proofErr w:type="gramEnd"/>
+            <w:r>
+              <w:rPr>
+                <w:bCs/>
+                <w:iCs/>
+                <w:lang w:val="en"/>
+              </w:rPr>
+              <w:t>_to_celsius</w:t>
+            </w:r>
+            <w:proofErr w:type="spellEnd"/>
             <w:r>
               <w:rPr>
                 <w:bCs/>
@@ -1181,7 +1310,15 @@
               <w:t xml:space="preserve"> – </w:t>
             </w:r>
             <w:r>
-              <w:t>The input value. Can be any positive or negative integer. No default value.</w:t>
+              <w:t xml:space="preserve">The input value. Can be any positive or negative integer. No default </w:t>
+            </w:r>
+            <w:proofErr w:type="gramStart"/>
+            <w:r>
+              <w:t>value</w:t>
+            </w:r>
+            <w:proofErr w:type="gramEnd"/>
+            <w:r>
+              <w:t>.</w:t>
             </w:r>
           </w:p>
         </w:tc>
@@ -1197,18 +1334,498 @@
     </w:p>
     <w:p>
       <w:pPr>
+        <w:pStyle w:val="Heading3"/>
+        <w:rPr>
+          <w:lang w:val="en"/>
+        </w:rPr>
+      </w:pPr>
+      <w:r>
+        <w:rPr>
+          <w:lang w:val="en"/>
+        </w:rPr>
+        <w:t>Example:</w:t>
+      </w:r>
+    </w:p>
+    <w:tbl>
+      <w:tblPr>
+        <w:tblStyle w:val="TableGrid"/>
+        <w:tblW w:w="8118" w:type="dxa"/>
+        <w:jc w:val="center"/>
+        <w:tblBorders>
+          <w:top w:val="single" w:sz="24" w:space="0" w:color="9CC2E5" w:themeColor="accent5" w:themeTint="99"/>
+          <w:left w:val="none" w:sz="0" w:space="0" w:color="auto"/>
+          <w:bottom w:val="none" w:sz="0" w:space="0" w:color="auto"/>
+          <w:right w:val="none" w:sz="0" w:space="0" w:color="auto"/>
+          <w:insideH w:val="none" w:sz="0" w:space="0" w:color="auto"/>
+          <w:insideV w:val="none" w:sz="0" w:space="0" w:color="auto"/>
+        </w:tblBorders>
+        <w:shd w:val="clear" w:color="auto" w:fill="E2EFD9" w:themeFill="accent6" w:themeFillTint="33"/>
+        <w:tblLook w:val="04A0" w:firstRow="1" w:lastRow="0" w:firstColumn="1" w:lastColumn="0" w:noHBand="0" w:noVBand="1"/>
+      </w:tblPr>
+      <w:tblGrid>
+        <w:gridCol w:w="8118"/>
+      </w:tblGrid>
+      <w:tr>
+        <w:trPr>
+          <w:jc w:val="center"/>
+        </w:trPr>
+        <w:tc>
+          <w:tcPr>
+            <w:tcW w:w="8118" w:type="dxa"/>
+            <w:tcBorders>
+              <w:top w:val="double" w:sz="4" w:space="0" w:color="70AD47" w:themeColor="accent6"/>
+              <w:left w:val="double" w:sz="4" w:space="0" w:color="70AD47" w:themeColor="accent6"/>
+              <w:bottom w:val="double" w:sz="4" w:space="0" w:color="70AD47" w:themeColor="accent6"/>
+              <w:right w:val="double" w:sz="4" w:space="0" w:color="70AD47" w:themeColor="accent6"/>
+            </w:tcBorders>
+            <w:shd w:val="clear" w:color="auto" w:fill="E2EFD9" w:themeFill="accent6" w:themeFillTint="33"/>
+          </w:tcPr>
+          <w:p>
+            <w:pPr>
+              <w:autoSpaceDE w:val="0"/>
+              <w:autoSpaceDN w:val="0"/>
+              <w:adjustRightInd w:val="0"/>
+              <w:rPr>
+                <w:rFonts w:ascii="Courier New" w:hAnsi="Courier New" w:cs="Courier New"/>
+                <w:sz w:val="18"/>
+                <w:szCs w:val="18"/>
+              </w:rPr>
+            </w:pPr>
+          </w:p>
+          <w:p>
+            <w:pPr>
+              <w:rPr>
+                <w:szCs w:val="20"/>
+              </w:rPr>
+            </w:pPr>
+            <w:r>
+              <w:rPr>
+                <w:szCs w:val="20"/>
+              </w:rPr>
+              <w:t xml:space="preserve">&gt;&gt;&gt; from </w:t>
+            </w:r>
+            <w:proofErr w:type="spellStart"/>
+            <w:r>
+              <w:rPr>
+                <w:szCs w:val="20"/>
+              </w:rPr>
+              <w:t>cedargrove_unit_</w:t>
+            </w:r>
+            <w:proofErr w:type="gramStart"/>
+            <w:r>
+              <w:rPr>
+                <w:szCs w:val="20"/>
+              </w:rPr>
+              <w:t>converter.</w:t>
+            </w:r>
+            <w:r>
+              <w:rPr>
+                <w:szCs w:val="20"/>
+              </w:rPr>
+              <w:t>temperature</w:t>
+            </w:r>
+            <w:proofErr w:type="spellEnd"/>
+            <w:proofErr w:type="gramEnd"/>
+            <w:r>
+              <w:rPr>
+                <w:szCs w:val="20"/>
+              </w:rPr>
+              <w:t xml:space="preserve"> import </w:t>
+            </w:r>
+            <w:r>
+              <w:rPr>
+                <w:szCs w:val="20"/>
+              </w:rPr>
+              <w:t>*</w:t>
+            </w:r>
+          </w:p>
+          <w:p>
+            <w:pPr>
+              <w:rPr>
+                <w:szCs w:val="20"/>
+              </w:rPr>
+            </w:pPr>
+            <w:r>
+              <w:rPr>
+                <w:szCs w:val="20"/>
+              </w:rPr>
+              <w:t xml:space="preserve">&gt;&gt;&gt; </w:t>
+            </w:r>
+            <w:proofErr w:type="spellStart"/>
+            <w:r>
+              <w:rPr>
+                <w:szCs w:val="20"/>
+              </w:rPr>
+              <w:t>celsius_to_</w:t>
+            </w:r>
+            <w:proofErr w:type="gramStart"/>
+            <w:r>
+              <w:rPr>
+                <w:szCs w:val="20"/>
+              </w:rPr>
+              <w:t>fahrenheit</w:t>
+            </w:r>
+            <w:proofErr w:type="spellEnd"/>
+            <w:r>
+              <w:rPr>
+                <w:szCs w:val="20"/>
+              </w:rPr>
+              <w:t>(</w:t>
+            </w:r>
+            <w:proofErr w:type="gramEnd"/>
+            <w:r>
+              <w:rPr>
+                <w:szCs w:val="20"/>
+              </w:rPr>
+              <w:t>100)  # Celsius to Fahrenheit Converter</w:t>
+            </w:r>
+          </w:p>
+          <w:p>
+            <w:pPr>
+              <w:rPr>
+                <w:szCs w:val="20"/>
+              </w:rPr>
+            </w:pPr>
+            <w:r>
+              <w:rPr>
+                <w:szCs w:val="20"/>
+              </w:rPr>
+              <w:t>212.0</w:t>
+            </w:r>
+          </w:p>
+          <w:p>
+            <w:pPr>
+              <w:rPr>
+                <w:szCs w:val="20"/>
+              </w:rPr>
+            </w:pPr>
+          </w:p>
+          <w:p>
+            <w:pPr>
+              <w:rPr>
+                <w:szCs w:val="20"/>
+              </w:rPr>
+            </w:pPr>
+            <w:r>
+              <w:rPr>
+                <w:szCs w:val="20"/>
+              </w:rPr>
+              <w:t xml:space="preserve">&gt;&gt;&gt; </w:t>
+            </w:r>
+            <w:proofErr w:type="spellStart"/>
+            <w:r>
+              <w:rPr>
+                <w:szCs w:val="20"/>
+              </w:rPr>
+              <w:t>celsius_to_</w:t>
+            </w:r>
+            <w:proofErr w:type="gramStart"/>
+            <w:r>
+              <w:rPr>
+                <w:szCs w:val="20"/>
+              </w:rPr>
+              <w:t>fahrenheit</w:t>
+            </w:r>
+            <w:proofErr w:type="spellEnd"/>
+            <w:r>
+              <w:rPr>
+                <w:szCs w:val="20"/>
+              </w:rPr>
+              <w:t>(</w:t>
+            </w:r>
+            <w:proofErr w:type="gramEnd"/>
+            <w:r>
+              <w:rPr>
+                <w:szCs w:val="20"/>
+              </w:rPr>
+              <w:t>0)</w:t>
+            </w:r>
+          </w:p>
+          <w:p>
+            <w:pPr>
+              <w:rPr>
+                <w:szCs w:val="20"/>
+              </w:rPr>
+            </w:pPr>
+            <w:r>
+              <w:rPr>
+                <w:szCs w:val="20"/>
+              </w:rPr>
+              <w:t>32.0</w:t>
+            </w:r>
+          </w:p>
+          <w:p>
+            <w:pPr>
+              <w:rPr>
+                <w:szCs w:val="20"/>
+              </w:rPr>
+            </w:pPr>
+          </w:p>
+          <w:p>
+            <w:pPr>
+              <w:rPr>
+                <w:szCs w:val="20"/>
+              </w:rPr>
+            </w:pPr>
+            <w:r>
+              <w:rPr>
+                <w:szCs w:val="20"/>
+              </w:rPr>
+              <w:lastRenderedPageBreak/>
+              <w:t xml:space="preserve">&gt;&gt;&gt; </w:t>
+            </w:r>
+            <w:proofErr w:type="spellStart"/>
+            <w:r>
+              <w:rPr>
+                <w:szCs w:val="20"/>
+              </w:rPr>
+              <w:t>fahrenheit_to_</w:t>
+            </w:r>
+            <w:proofErr w:type="gramStart"/>
+            <w:r>
+              <w:rPr>
+                <w:szCs w:val="20"/>
+              </w:rPr>
+              <w:t>celsius</w:t>
+            </w:r>
+            <w:proofErr w:type="spellEnd"/>
+            <w:r>
+              <w:rPr>
+                <w:szCs w:val="20"/>
+              </w:rPr>
+              <w:t>(</w:t>
+            </w:r>
+            <w:proofErr w:type="gramEnd"/>
+            <w:r>
+              <w:rPr>
+                <w:szCs w:val="20"/>
+              </w:rPr>
+              <w:t>32)   # Fahrenheit to Celsius Converter</w:t>
+            </w:r>
+          </w:p>
+          <w:p>
+            <w:pPr>
+              <w:rPr>
+                <w:szCs w:val="20"/>
+              </w:rPr>
+            </w:pPr>
+            <w:r>
+              <w:rPr>
+                <w:szCs w:val="20"/>
+              </w:rPr>
+              <w:t>0.0</w:t>
+            </w:r>
+          </w:p>
+          <w:p>
+            <w:pPr>
+              <w:rPr>
+                <w:szCs w:val="20"/>
+              </w:rPr>
+            </w:pPr>
+          </w:p>
+          <w:p>
+            <w:pPr>
+              <w:rPr>
+                <w:szCs w:val="20"/>
+              </w:rPr>
+            </w:pPr>
+            <w:r>
+              <w:rPr>
+                <w:szCs w:val="20"/>
+              </w:rPr>
+              <w:t xml:space="preserve">&gt;&gt;&gt; </w:t>
+            </w:r>
+            <w:proofErr w:type="spellStart"/>
+            <w:r>
+              <w:rPr>
+                <w:szCs w:val="20"/>
+              </w:rPr>
+              <w:t>fahrenheit_to_</w:t>
+            </w:r>
+            <w:proofErr w:type="gramStart"/>
+            <w:r>
+              <w:rPr>
+                <w:szCs w:val="20"/>
+              </w:rPr>
+              <w:t>celsius</w:t>
+            </w:r>
+            <w:proofErr w:type="spellEnd"/>
+            <w:r>
+              <w:rPr>
+                <w:szCs w:val="20"/>
+              </w:rPr>
+              <w:t>(</w:t>
+            </w:r>
+            <w:proofErr w:type="gramEnd"/>
+            <w:r>
+              <w:rPr>
+                <w:szCs w:val="20"/>
+              </w:rPr>
+              <w:t>212)</w:t>
+            </w:r>
+          </w:p>
+          <w:p>
+            <w:pPr>
+              <w:rPr>
+                <w:szCs w:val="20"/>
+              </w:rPr>
+            </w:pPr>
+            <w:r>
+              <w:rPr>
+                <w:szCs w:val="20"/>
+              </w:rPr>
+              <w:t>100.0</w:t>
+            </w:r>
+          </w:p>
+          <w:p>
+            <w:pPr>
+              <w:rPr>
+                <w:szCs w:val="20"/>
+              </w:rPr>
+            </w:pPr>
+          </w:p>
+          <w:p>
+            <w:pPr>
+              <w:rPr>
+                <w:szCs w:val="20"/>
+              </w:rPr>
+            </w:pPr>
+            <w:r>
+              <w:rPr>
+                <w:szCs w:val="20"/>
+              </w:rPr>
+              <w:t xml:space="preserve">&gt;&gt;&gt; </w:t>
+            </w:r>
+            <w:proofErr w:type="spellStart"/>
+            <w:r>
+              <w:rPr>
+                <w:szCs w:val="20"/>
+              </w:rPr>
+              <w:t>celsius_to_</w:t>
+            </w:r>
+            <w:proofErr w:type="gramStart"/>
+            <w:r>
+              <w:rPr>
+                <w:szCs w:val="20"/>
+              </w:rPr>
+              <w:t>kelvin</w:t>
+            </w:r>
+            <w:proofErr w:type="spellEnd"/>
+            <w:r>
+              <w:rPr>
+                <w:szCs w:val="20"/>
+              </w:rPr>
+              <w:t>(</w:t>
+            </w:r>
+            <w:proofErr w:type="gramEnd"/>
+            <w:r>
+              <w:rPr>
+                <w:szCs w:val="20"/>
+              </w:rPr>
+              <w:t>0)        # Celsius to Kelvin Converter</w:t>
+            </w:r>
+          </w:p>
+          <w:p>
+            <w:pPr>
+              <w:rPr>
+                <w:szCs w:val="20"/>
+              </w:rPr>
+            </w:pPr>
+            <w:r>
+              <w:rPr>
+                <w:szCs w:val="20"/>
+              </w:rPr>
+              <w:t>273.15</w:t>
+            </w:r>
+          </w:p>
+          <w:p>
+            <w:pPr>
+              <w:rPr>
+                <w:szCs w:val="20"/>
+              </w:rPr>
+            </w:pPr>
+          </w:p>
+          <w:p>
+            <w:pPr>
+              <w:rPr>
+                <w:szCs w:val="20"/>
+              </w:rPr>
+            </w:pPr>
+            <w:r>
+              <w:rPr>
+                <w:szCs w:val="20"/>
+              </w:rPr>
+              <w:t xml:space="preserve">&gt;&gt;&gt; </w:t>
+            </w:r>
+            <w:proofErr w:type="spellStart"/>
+            <w:r>
+              <w:rPr>
+                <w:szCs w:val="20"/>
+              </w:rPr>
+              <w:t>kelvin_to_</w:t>
+            </w:r>
+            <w:proofErr w:type="gramStart"/>
+            <w:r>
+              <w:rPr>
+                <w:szCs w:val="20"/>
+              </w:rPr>
+              <w:t>celsius</w:t>
+            </w:r>
+            <w:proofErr w:type="spellEnd"/>
+            <w:r>
+              <w:rPr>
+                <w:szCs w:val="20"/>
+              </w:rPr>
+              <w:t>(</w:t>
+            </w:r>
+            <w:proofErr w:type="gramEnd"/>
+            <w:r>
+              <w:rPr>
+                <w:szCs w:val="20"/>
+              </w:rPr>
+              <w:t>273.15)   # Kelvin to Celsius Converter</w:t>
+            </w:r>
+          </w:p>
+          <w:p>
+            <w:pPr>
+              <w:rPr>
+                <w:szCs w:val="20"/>
+              </w:rPr>
+            </w:pPr>
+            <w:r>
+              <w:rPr>
+                <w:szCs w:val="20"/>
+              </w:rPr>
+              <w:t>0.0</w:t>
+            </w:r>
+          </w:p>
+          <w:p>
+            <w:pPr>
+              <w:rPr>
+                <w:rFonts w:ascii="Courier New" w:hAnsi="Courier New" w:cs="Courier New"/>
+                <w:sz w:val="18"/>
+                <w:szCs w:val="18"/>
+              </w:rPr>
+            </w:pPr>
+          </w:p>
+        </w:tc>
+      </w:tr>
+    </w:tbl>
+    <w:p>
+      <w:pPr>
         <w:rPr>
           <w:szCs w:val="20"/>
           <w:lang w:val="en"/>
         </w:rPr>
       </w:pPr>
-      <w:r>
+    </w:p>
+    <w:p>
+      <w:pPr>
         <w:rPr>
           <w:szCs w:val="20"/>
           <w:lang w:val="en"/>
         </w:rPr>
-        <w:br w:type="page"/>
-      </w:r>
+      </w:pPr>
     </w:p>
     <w:tbl>
       <w:tblPr>
@@ -1242,6 +1859,7 @@
                 <w:lang w:val="en"/>
               </w:rPr>
             </w:pPr>
+            <w:proofErr w:type="spellStart"/>
             <w:r>
               <w:rPr>
                 <w:bCs/>
@@ -1250,7 +1868,6 @@
                 <w:color w:val="2E74B5" w:themeColor="accent5" w:themeShade="BF"/>
                 <w:lang w:val="en"/>
               </w:rPr>
-              <w:lastRenderedPageBreak/>
               <w:t>helper_</w:t>
             </w:r>
             <w:r>
@@ -1261,32 +1878,9 @@
                 <w:color w:val="2E74B5" w:themeColor="accent5" w:themeShade="BF"/>
                 <w:lang w:val="en"/>
               </w:rPr>
-              <w:t xml:space="preserve">class </w:t>
-            </w:r>
-            <w:r>
-              <w:rPr>
-                <w:bCs/>
-                <w:iCs/>
-                <w:lang w:val="en"/>
-              </w:rPr>
-              <w:t>temperature.</w:t>
-            </w:r>
-            <w:r>
-              <w:rPr>
-                <w:bCs/>
-                <w:iCs/>
-                <w:lang w:val="en"/>
-              </w:rPr>
-              <w:t>dew_point</w:t>
-            </w:r>
-            <w:r>
-              <w:rPr>
-                <w:bCs/>
-                <w:color w:val="2E74B5" w:themeColor="accent5" w:themeShade="BF"/>
-                <w:lang w:val="en"/>
-              </w:rPr>
-              <w:t>(</w:t>
-            </w:r>
+              <w:t>class</w:t>
+            </w:r>
+            <w:proofErr w:type="spellEnd"/>
             <w:r>
               <w:rPr>
                 <w:bCs/>
@@ -1295,8 +1889,37 @@
                 <w:color w:val="2E74B5" w:themeColor="accent5" w:themeShade="BF"/>
                 <w:lang w:val="en"/>
               </w:rPr>
-              <w:t>d</w:t>
-            </w:r>
+              <w:t xml:space="preserve"> </w:t>
+            </w:r>
+            <w:proofErr w:type="spellStart"/>
+            <w:r>
+              <w:rPr>
+                <w:bCs/>
+                <w:iCs/>
+                <w:lang w:val="en"/>
+              </w:rPr>
+              <w:t>temperature.dew_</w:t>
+            </w:r>
+            <w:proofErr w:type="gramStart"/>
+            <w:r>
+              <w:rPr>
+                <w:bCs/>
+                <w:iCs/>
+                <w:lang w:val="en"/>
+              </w:rPr>
+              <w:t>point</w:t>
+            </w:r>
+            <w:proofErr w:type="spellEnd"/>
+            <w:r>
+              <w:rPr>
+                <w:bCs/>
+                <w:color w:val="2E74B5" w:themeColor="accent5" w:themeShade="BF"/>
+                <w:lang w:val="en"/>
+              </w:rPr>
+              <w:t>(</w:t>
+            </w:r>
+            <w:proofErr w:type="spellStart"/>
+            <w:proofErr w:type="gramEnd"/>
             <w:r>
               <w:rPr>
                 <w:bCs/>
@@ -1305,7 +1928,7 @@
                 <w:color w:val="2E74B5" w:themeColor="accent5" w:themeShade="BF"/>
                 <w:lang w:val="en"/>
               </w:rPr>
-              <w:t>e</w:t>
+              <w:t>d</w:t>
             </w:r>
             <w:r>
               <w:rPr>
@@ -1315,7 +1938,28 @@
                 <w:color w:val="2E74B5" w:themeColor="accent5" w:themeShade="BF"/>
                 <w:lang w:val="en"/>
               </w:rPr>
-              <w:t>g_c, humidity, verbose=False</w:t>
+              <w:t>e</w:t>
+            </w:r>
+            <w:r>
+              <w:rPr>
+                <w:bCs/>
+                <w:i/>
+                <w:iCs/>
+                <w:color w:val="2E74B5" w:themeColor="accent5" w:themeShade="BF"/>
+                <w:lang w:val="en"/>
+              </w:rPr>
+              <w:t>g_c</w:t>
+            </w:r>
+            <w:proofErr w:type="spellEnd"/>
+            <w:r>
+              <w:rPr>
+                <w:bCs/>
+                <w:i/>
+                <w:iCs/>
+                <w:color w:val="2E74B5" w:themeColor="accent5" w:themeShade="BF"/>
+                <w:lang w:val="en"/>
+              </w:rPr>
+              <w:t>, humidity, verbose=False</w:t>
             </w:r>
             <w:r>
               <w:rPr>
@@ -1407,7 +2051,14 @@
         <w:rPr>
           <w:lang w:val="en"/>
         </w:rPr>
-        <w:t xml:space="preserve"> and an observation string (if verbose is True) </w:t>
+        <w:t xml:space="preserve"> and an observation string (if verbose is True</w:t>
+      </w:r>
+      <w:proofErr w:type="gramStart"/>
+      <w:r>
+        <w:rPr>
+          <w:lang w:val="en"/>
+        </w:rPr>
+        <w:t xml:space="preserve">) </w:t>
       </w:r>
       <w:r>
         <w:rPr>
@@ -1415,6 +2066,7 @@
         </w:rPr>
         <w:t>.</w:t>
       </w:r>
+      <w:proofErr w:type="gramEnd"/>
     </w:p>
     <w:tbl>
       <w:tblPr>
@@ -1505,7 +2157,15 @@
               <w:t>value in the range of -99 to 99</w:t>
             </w:r>
             <w:r>
-              <w:t>. No default value.</w:t>
+              <w:t xml:space="preserve">. No default </w:t>
+            </w:r>
+            <w:proofErr w:type="gramStart"/>
+            <w:r>
+              <w:t>value</w:t>
+            </w:r>
+            <w:proofErr w:type="gramEnd"/>
+            <w:r>
+              <w:t>.</w:t>
             </w:r>
           </w:p>
           <w:p>
@@ -1523,12 +2183,266 @@
               <w:t>Humidity</w:t>
             </w:r>
             <w:r>
-              <w:t xml:space="preserve"> – The humidity percent input value. Can be any positive value in the range of 0 to 100. No default value.</w:t>
+              <w:t xml:space="preserve"> – The humidity percent input value. Can be any positive value in the range of 0 to 100. No default </w:t>
+            </w:r>
+            <w:proofErr w:type="gramStart"/>
+            <w:r>
+              <w:t>value</w:t>
+            </w:r>
+            <w:proofErr w:type="gramEnd"/>
+            <w:r>
+              <w:t>.</w:t>
             </w:r>
           </w:p>
         </w:tc>
       </w:tr>
     </w:tbl>
+    <w:p>
+      <w:pPr>
+        <w:rPr>
+          <w:szCs w:val="20"/>
+          <w:lang w:val="en"/>
+        </w:rPr>
+      </w:pPr>
+    </w:p>
+    <w:p>
+      <w:pPr>
+        <w:pStyle w:val="Heading3"/>
+        <w:rPr>
+          <w:lang w:val="en"/>
+        </w:rPr>
+      </w:pPr>
+      <w:r>
+        <w:rPr>
+          <w:lang w:val="en"/>
+        </w:rPr>
+        <w:t>Example:</w:t>
+      </w:r>
+    </w:p>
+    <w:tbl>
+      <w:tblPr>
+        <w:tblStyle w:val="TableGrid"/>
+        <w:tblW w:w="8118" w:type="dxa"/>
+        <w:jc w:val="center"/>
+        <w:tblBorders>
+          <w:top w:val="single" w:sz="24" w:space="0" w:color="9CC2E5" w:themeColor="accent5" w:themeTint="99"/>
+          <w:left w:val="none" w:sz="0" w:space="0" w:color="auto"/>
+          <w:bottom w:val="none" w:sz="0" w:space="0" w:color="auto"/>
+          <w:right w:val="none" w:sz="0" w:space="0" w:color="auto"/>
+          <w:insideH w:val="none" w:sz="0" w:space="0" w:color="auto"/>
+          <w:insideV w:val="none" w:sz="0" w:space="0" w:color="auto"/>
+        </w:tblBorders>
+        <w:shd w:val="clear" w:color="auto" w:fill="E2EFD9" w:themeFill="accent6" w:themeFillTint="33"/>
+        <w:tblLook w:val="04A0" w:firstRow="1" w:lastRow="0" w:firstColumn="1" w:lastColumn="0" w:noHBand="0" w:noVBand="1"/>
+      </w:tblPr>
+      <w:tblGrid>
+        <w:gridCol w:w="8118"/>
+      </w:tblGrid>
+      <w:tr>
+        <w:trPr>
+          <w:jc w:val="center"/>
+        </w:trPr>
+        <w:tc>
+          <w:tcPr>
+            <w:tcW w:w="8118" w:type="dxa"/>
+            <w:tcBorders>
+              <w:top w:val="double" w:sz="4" w:space="0" w:color="70AD47" w:themeColor="accent6"/>
+              <w:left w:val="double" w:sz="4" w:space="0" w:color="70AD47" w:themeColor="accent6"/>
+              <w:bottom w:val="double" w:sz="4" w:space="0" w:color="70AD47" w:themeColor="accent6"/>
+              <w:right w:val="double" w:sz="4" w:space="0" w:color="70AD47" w:themeColor="accent6"/>
+            </w:tcBorders>
+            <w:shd w:val="clear" w:color="auto" w:fill="E2EFD9" w:themeFill="accent6" w:themeFillTint="33"/>
+          </w:tcPr>
+          <w:p>
+            <w:pPr>
+              <w:autoSpaceDE w:val="0"/>
+              <w:autoSpaceDN w:val="0"/>
+              <w:adjustRightInd w:val="0"/>
+              <w:rPr>
+                <w:rFonts w:ascii="Courier New" w:hAnsi="Courier New" w:cs="Courier New"/>
+                <w:sz w:val="18"/>
+                <w:szCs w:val="18"/>
+              </w:rPr>
+            </w:pPr>
+          </w:p>
+          <w:p>
+            <w:pPr>
+              <w:rPr>
+                <w:szCs w:val="20"/>
+              </w:rPr>
+            </w:pPr>
+            <w:r>
+              <w:rPr>
+                <w:szCs w:val="20"/>
+              </w:rPr>
+              <w:t xml:space="preserve">&gt;&gt;&gt; from </w:t>
+            </w:r>
+            <w:proofErr w:type="spellStart"/>
+            <w:r>
+              <w:rPr>
+                <w:szCs w:val="20"/>
+              </w:rPr>
+              <w:t>cedargrove_unit_</w:t>
+            </w:r>
+            <w:proofErr w:type="gramStart"/>
+            <w:r>
+              <w:rPr>
+                <w:szCs w:val="20"/>
+              </w:rPr>
+              <w:t>converter.temperature</w:t>
+            </w:r>
+            <w:proofErr w:type="spellEnd"/>
+            <w:proofErr w:type="gramEnd"/>
+            <w:r>
+              <w:rPr>
+                <w:szCs w:val="20"/>
+              </w:rPr>
+              <w:t xml:space="preserve"> import </w:t>
+            </w:r>
+            <w:proofErr w:type="spellStart"/>
+            <w:r>
+              <w:rPr>
+                <w:szCs w:val="20"/>
+              </w:rPr>
+              <w:t>dew_point</w:t>
+            </w:r>
+            <w:proofErr w:type="spellEnd"/>
+          </w:p>
+          <w:p>
+            <w:pPr>
+              <w:rPr>
+                <w:szCs w:val="20"/>
+              </w:rPr>
+            </w:pPr>
+            <w:r>
+              <w:rPr>
+                <w:szCs w:val="20"/>
+              </w:rPr>
+              <w:t xml:space="preserve">&gt;&gt;&gt; </w:t>
+            </w:r>
+            <w:proofErr w:type="spellStart"/>
+            <w:r>
+              <w:rPr>
+                <w:szCs w:val="20"/>
+              </w:rPr>
+              <w:t>dew_</w:t>
+            </w:r>
+            <w:proofErr w:type="gramStart"/>
+            <w:r>
+              <w:rPr>
+                <w:szCs w:val="20"/>
+              </w:rPr>
+              <w:t>point</w:t>
+            </w:r>
+            <w:proofErr w:type="spellEnd"/>
+            <w:r>
+              <w:rPr>
+                <w:szCs w:val="20"/>
+              </w:rPr>
+              <w:t>(</w:t>
+            </w:r>
+            <w:proofErr w:type="gramEnd"/>
+            <w:r>
+              <w:rPr>
+                <w:szCs w:val="20"/>
+              </w:rPr>
+              <w:t>30, 50)           # Dew Point Converter</w:t>
+            </w:r>
+          </w:p>
+          <w:p>
+            <w:pPr>
+              <w:rPr>
+                <w:szCs w:val="20"/>
+              </w:rPr>
+            </w:pPr>
+            <w:r>
+              <w:rPr>
+                <w:szCs w:val="20"/>
+              </w:rPr>
+              <w:t>18.46</w:t>
+            </w:r>
+          </w:p>
+          <w:p>
+            <w:pPr>
+              <w:rPr>
+                <w:szCs w:val="20"/>
+              </w:rPr>
+            </w:pPr>
+          </w:p>
+          <w:p>
+            <w:pPr>
+              <w:rPr>
+                <w:szCs w:val="20"/>
+              </w:rPr>
+            </w:pPr>
+            <w:r>
+              <w:rPr>
+                <w:szCs w:val="20"/>
+              </w:rPr>
+              <w:t xml:space="preserve">&gt;&gt;&gt; </w:t>
+            </w:r>
+            <w:proofErr w:type="spellStart"/>
+            <w:r>
+              <w:rPr>
+                <w:szCs w:val="20"/>
+              </w:rPr>
+              <w:t>dew_</w:t>
+            </w:r>
+            <w:proofErr w:type="gramStart"/>
+            <w:r>
+              <w:rPr>
+                <w:szCs w:val="20"/>
+              </w:rPr>
+              <w:t>point</w:t>
+            </w:r>
+            <w:proofErr w:type="spellEnd"/>
+            <w:r>
+              <w:rPr>
+                <w:szCs w:val="20"/>
+              </w:rPr>
+              <w:t>(</w:t>
+            </w:r>
+            <w:proofErr w:type="gramEnd"/>
+            <w:r>
+              <w:rPr>
+                <w:szCs w:val="20"/>
+              </w:rPr>
+              <w:t>30, 50, verbose=True)</w:t>
+            </w:r>
+          </w:p>
+          <w:p>
+            <w:pPr>
+              <w:rPr>
+                <w:szCs w:val="20"/>
+              </w:rPr>
+            </w:pPr>
+            <w:r>
+              <w:rPr>
+                <w:szCs w:val="20"/>
+              </w:rPr>
+              <w:t>(18.46, 'Caution: Somewhat uncomfortable for most people.')</w:t>
+            </w:r>
+          </w:p>
+          <w:p>
+            <w:pPr>
+              <w:rPr>
+                <w:rFonts w:ascii="Courier New" w:hAnsi="Courier New" w:cs="Courier New"/>
+                <w:sz w:val="18"/>
+                <w:szCs w:val="18"/>
+              </w:rPr>
+            </w:pPr>
+          </w:p>
+        </w:tc>
+      </w:tr>
+    </w:tbl>
+    <w:p>
+      <w:pPr>
+        <w:rPr>
+          <w:szCs w:val="20"/>
+          <w:lang w:val="en"/>
+        </w:rPr>
+      </w:pPr>
+    </w:p>
     <w:p>
       <w:pPr>
         <w:rPr>
@@ -1569,6 +2483,7 @@
                 <w:lang w:val="en"/>
               </w:rPr>
             </w:pPr>
+            <w:proofErr w:type="spellStart"/>
             <w:r>
               <w:rPr>
                 <w:bCs/>
@@ -1587,32 +2502,9 @@
                 <w:color w:val="2E74B5" w:themeColor="accent5" w:themeShade="BF"/>
                 <w:lang w:val="en"/>
               </w:rPr>
-              <w:t xml:space="preserve">class </w:t>
-            </w:r>
-            <w:r>
-              <w:rPr>
-                <w:bCs/>
-                <w:iCs/>
-                <w:lang w:val="en"/>
-              </w:rPr>
-              <w:t>temperature.</w:t>
-            </w:r>
-            <w:r>
-              <w:rPr>
-                <w:bCs/>
-                <w:iCs/>
-                <w:lang w:val="en"/>
-              </w:rPr>
-              <w:t>heat_index</w:t>
-            </w:r>
-            <w:r>
-              <w:rPr>
-                <w:bCs/>
-                <w:color w:val="2E74B5" w:themeColor="accent5" w:themeShade="BF"/>
-                <w:lang w:val="en"/>
-              </w:rPr>
-              <w:t>(</w:t>
-            </w:r>
+              <w:t>class</w:t>
+            </w:r>
+            <w:proofErr w:type="spellEnd"/>
             <w:r>
               <w:rPr>
                 <w:bCs/>
@@ -1621,8 +2513,37 @@
                 <w:color w:val="2E74B5" w:themeColor="accent5" w:themeShade="BF"/>
                 <w:lang w:val="en"/>
               </w:rPr>
-              <w:t>d</w:t>
-            </w:r>
+              <w:t xml:space="preserve"> </w:t>
+            </w:r>
+            <w:proofErr w:type="spellStart"/>
+            <w:proofErr w:type="gramStart"/>
+            <w:r>
+              <w:rPr>
+                <w:bCs/>
+                <w:iCs/>
+                <w:lang w:val="en"/>
+              </w:rPr>
+              <w:t>temperature.heat</w:t>
+            </w:r>
+            <w:proofErr w:type="gramEnd"/>
+            <w:r>
+              <w:rPr>
+                <w:bCs/>
+                <w:iCs/>
+                <w:lang w:val="en"/>
+              </w:rPr>
+              <w:t>_index</w:t>
+            </w:r>
+            <w:proofErr w:type="spellEnd"/>
+            <w:r>
+              <w:rPr>
+                <w:bCs/>
+                <w:color w:val="2E74B5" w:themeColor="accent5" w:themeShade="BF"/>
+                <w:lang w:val="en"/>
+              </w:rPr>
+              <w:t>(</w:t>
+            </w:r>
+            <w:proofErr w:type="spellStart"/>
             <w:r>
               <w:rPr>
                 <w:bCs/>
@@ -1631,7 +2552,7 @@
                 <w:color w:val="2E74B5" w:themeColor="accent5" w:themeShade="BF"/>
                 <w:lang w:val="en"/>
               </w:rPr>
-              <w:t>e</w:t>
+              <w:t>d</w:t>
             </w:r>
             <w:r>
               <w:rPr>
@@ -1641,7 +2562,28 @@
                 <w:color w:val="2E74B5" w:themeColor="accent5" w:themeShade="BF"/>
                 <w:lang w:val="en"/>
               </w:rPr>
-              <w:t>g_c, humidity, verbose=False</w:t>
+              <w:t>e</w:t>
+            </w:r>
+            <w:r>
+              <w:rPr>
+                <w:bCs/>
+                <w:i/>
+                <w:iCs/>
+                <w:color w:val="2E74B5" w:themeColor="accent5" w:themeShade="BF"/>
+                <w:lang w:val="en"/>
+              </w:rPr>
+              <w:t>g_c</w:t>
+            </w:r>
+            <w:proofErr w:type="spellEnd"/>
+            <w:r>
+              <w:rPr>
+                <w:bCs/>
+                <w:i/>
+                <w:iCs/>
+                <w:color w:val="2E74B5" w:themeColor="accent5" w:themeShade="BF"/>
+                <w:lang w:val="en"/>
+              </w:rPr>
+              <w:t>, humidity, verbose=False</w:t>
             </w:r>
             <w:r>
               <w:rPr>
@@ -1679,7 +2621,31 @@
         <w:rPr>
           <w:lang w:val="en"/>
         </w:rPr>
-        <w:t xml:space="preserve">temperature and humidity to a </w:t>
+        <w:t>temperature and humidity to a heat index</w:t>
+      </w:r>
+      <w:r>
+        <w:rPr>
+          <w:lang w:val="en"/>
+        </w:rPr>
+        <w:t xml:space="preserve"> (comfort)</w:t>
+      </w:r>
+      <w:r>
+        <w:rPr>
+          <w:lang w:val="en"/>
+        </w:rPr>
+        <w:t xml:space="preserve"> temperature value and observation string</w:t>
+      </w:r>
+      <w:r>
+        <w:rPr>
+          <w:lang w:val="en"/>
+        </w:rPr>
+        <w:t>.</w:t>
+      </w:r>
+      <w:r>
+        <w:rPr>
+          <w:lang w:val="en"/>
+        </w:rPr>
+        <w:t xml:space="preserve"> Temperature input value is degrees Celsius in the range of -99 to 99 degrees. Humidity input value is percent humidity in the range of 0 to 100. Returns a </w:t>
       </w:r>
       <w:r>
         <w:rPr>
@@ -1691,56 +2657,16 @@
         <w:rPr>
           <w:lang w:val="en"/>
         </w:rPr>
-        <w:t xml:space="preserve"> (comfort)</w:t>
-      </w:r>
-      <w:r>
-        <w:rPr>
-          <w:lang w:val="en"/>
-        </w:rPr>
-        <w:t xml:space="preserve"> temperature </w:t>
-      </w:r>
-      <w:r>
-        <w:rPr>
-          <w:lang w:val="en"/>
-        </w:rPr>
-        <w:t xml:space="preserve">value </w:t>
-      </w:r>
-      <w:r>
-        <w:rPr>
-          <w:lang w:val="en"/>
-        </w:rPr>
-        <w:t>and observation</w:t>
-      </w:r>
-      <w:r>
-        <w:rPr>
-          <w:lang w:val="en"/>
-        </w:rPr>
-        <w:t xml:space="preserve"> string</w:t>
-      </w:r>
-      <w:r>
-        <w:rPr>
-          <w:lang w:val="en"/>
-        </w:rPr>
-        <w:t>.</w:t>
-      </w:r>
-      <w:r>
-        <w:rPr>
-          <w:lang w:val="en"/>
-        </w:rPr>
-        <w:t xml:space="preserve"> Temperature input value is degrees Celsius in the range of -99 to 99 degrees. Humidity input value is percent humidity in the range of 0 to 100. Returns a </w:t>
-      </w:r>
-      <w:r>
-        <w:rPr>
-          <w:lang w:val="en"/>
-        </w:rPr>
-        <w:t>heat index</w:t>
-      </w:r>
-      <w:r>
-        <w:rPr>
-          <w:lang w:val="en"/>
-        </w:rPr>
-        <w:t xml:space="preserve"> value in degrees Celsius and an observation string (if verbose is True) .</w:t>
-      </w:r>
+        <w:t xml:space="preserve"> value in degrees Celsius and an observation string (if verbose is True</w:t>
+      </w:r>
+      <w:proofErr w:type="gramStart"/>
+      <w:r>
+        <w:rPr>
+          <w:lang w:val="en"/>
+        </w:rPr>
+        <w:t>) .</w:t>
+      </w:r>
+      <w:proofErr w:type="gramEnd"/>
     </w:p>
     <w:tbl>
       <w:tblPr>
@@ -1813,7 +2739,15 @@
               <w:t xml:space="preserve"> – </w:t>
             </w:r>
             <w:r>
-              <w:t>The temperature input value. Can be any positive or negative numeric value in the range of -99 to 99. No default value.</w:t>
+              <w:t xml:space="preserve">The temperature input value. Can be any positive or negative numeric value in the range of -99 to 99. No default </w:t>
+            </w:r>
+            <w:proofErr w:type="gramStart"/>
+            <w:r>
+              <w:t>value</w:t>
+            </w:r>
+            <w:proofErr w:type="gramEnd"/>
+            <w:r>
+              <w:t>.</w:t>
             </w:r>
           </w:p>
           <w:p>
@@ -1831,7 +2765,15 @@
               <w:t>Humidity</w:t>
             </w:r>
             <w:r>
-              <w:t xml:space="preserve"> – The humidity percent input value. Can be any positive value in the range of 0 to 100. No default value.</w:t>
+              <w:t xml:space="preserve"> – The humidity percent input value. Can be any positive value in the range of 0 to 100. No default </w:t>
+            </w:r>
+            <w:proofErr w:type="gramStart"/>
+            <w:r>
+              <w:t>value</w:t>
+            </w:r>
+            <w:proofErr w:type="gramEnd"/>
+            <w:r>
+              <w:t>.</w:t>
             </w:r>
           </w:p>
         </w:tc>
@@ -1847,18 +2789,258 @@
     </w:p>
     <w:p>
       <w:pPr>
+        <w:pStyle w:val="Heading3"/>
+        <w:rPr>
+          <w:lang w:val="en"/>
+        </w:rPr>
+      </w:pPr>
+      <w:r>
+        <w:rPr>
+          <w:lang w:val="en"/>
+        </w:rPr>
+        <w:lastRenderedPageBreak/>
+        <w:t>Example:</w:t>
+      </w:r>
+    </w:p>
+    <w:tbl>
+      <w:tblPr>
+        <w:tblStyle w:val="TableGrid"/>
+        <w:tblW w:w="8118" w:type="dxa"/>
+        <w:jc w:val="center"/>
+        <w:tblBorders>
+          <w:top w:val="single" w:sz="24" w:space="0" w:color="9CC2E5" w:themeColor="accent5" w:themeTint="99"/>
+          <w:left w:val="none" w:sz="0" w:space="0" w:color="auto"/>
+          <w:bottom w:val="none" w:sz="0" w:space="0" w:color="auto"/>
+          <w:right w:val="none" w:sz="0" w:space="0" w:color="auto"/>
+          <w:insideH w:val="none" w:sz="0" w:space="0" w:color="auto"/>
+          <w:insideV w:val="none" w:sz="0" w:space="0" w:color="auto"/>
+        </w:tblBorders>
+        <w:shd w:val="clear" w:color="auto" w:fill="E2EFD9" w:themeFill="accent6" w:themeFillTint="33"/>
+        <w:tblLook w:val="04A0" w:firstRow="1" w:lastRow="0" w:firstColumn="1" w:lastColumn="0" w:noHBand="0" w:noVBand="1"/>
+      </w:tblPr>
+      <w:tblGrid>
+        <w:gridCol w:w="8118"/>
+      </w:tblGrid>
+      <w:tr>
+        <w:trPr>
+          <w:jc w:val="center"/>
+        </w:trPr>
+        <w:tc>
+          <w:tcPr>
+            <w:tcW w:w="8118" w:type="dxa"/>
+            <w:tcBorders>
+              <w:top w:val="double" w:sz="4" w:space="0" w:color="70AD47" w:themeColor="accent6"/>
+              <w:left w:val="double" w:sz="4" w:space="0" w:color="70AD47" w:themeColor="accent6"/>
+              <w:bottom w:val="double" w:sz="4" w:space="0" w:color="70AD47" w:themeColor="accent6"/>
+              <w:right w:val="double" w:sz="4" w:space="0" w:color="70AD47" w:themeColor="accent6"/>
+            </w:tcBorders>
+            <w:shd w:val="clear" w:color="auto" w:fill="E2EFD9" w:themeFill="accent6" w:themeFillTint="33"/>
+          </w:tcPr>
+          <w:p>
+            <w:pPr>
+              <w:autoSpaceDE w:val="0"/>
+              <w:autoSpaceDN w:val="0"/>
+              <w:adjustRightInd w:val="0"/>
+              <w:rPr>
+                <w:rFonts w:ascii="Courier New" w:hAnsi="Courier New" w:cs="Courier New"/>
+                <w:sz w:val="18"/>
+                <w:szCs w:val="18"/>
+              </w:rPr>
+            </w:pPr>
+          </w:p>
+          <w:p>
+            <w:pPr>
+              <w:rPr>
+                <w:szCs w:val="20"/>
+              </w:rPr>
+            </w:pPr>
+            <w:r>
+              <w:rPr>
+                <w:szCs w:val="20"/>
+              </w:rPr>
+              <w:t xml:space="preserve">&gt;&gt;&gt; from </w:t>
+            </w:r>
+            <w:proofErr w:type="spellStart"/>
+            <w:r>
+              <w:rPr>
+                <w:szCs w:val="20"/>
+              </w:rPr>
+              <w:t>cedargrove_unit_</w:t>
+            </w:r>
+            <w:proofErr w:type="gramStart"/>
+            <w:r>
+              <w:rPr>
+                <w:szCs w:val="20"/>
+              </w:rPr>
+              <w:t>converter.temperature</w:t>
+            </w:r>
+            <w:proofErr w:type="spellEnd"/>
+            <w:proofErr w:type="gramEnd"/>
+            <w:r>
+              <w:rPr>
+                <w:szCs w:val="20"/>
+              </w:rPr>
+              <w:t xml:space="preserve"> import </w:t>
+            </w:r>
+            <w:proofErr w:type="spellStart"/>
+            <w:r>
+              <w:rPr>
+                <w:szCs w:val="20"/>
+              </w:rPr>
+              <w:t>heat_index</w:t>
+            </w:r>
+            <w:proofErr w:type="spellEnd"/>
+          </w:p>
+          <w:p>
+            <w:pPr>
+              <w:rPr>
+                <w:szCs w:val="20"/>
+              </w:rPr>
+            </w:pPr>
+            <w:r>
+              <w:rPr>
+                <w:szCs w:val="20"/>
+              </w:rPr>
+              <w:t xml:space="preserve">&gt;&gt;&gt; </w:t>
+            </w:r>
+            <w:proofErr w:type="spellStart"/>
+            <w:r>
+              <w:rPr>
+                <w:szCs w:val="20"/>
+              </w:rPr>
+              <w:t>dew_</w:t>
+            </w:r>
+            <w:proofErr w:type="gramStart"/>
+            <w:r>
+              <w:rPr>
+                <w:szCs w:val="20"/>
+              </w:rPr>
+              <w:t>point</w:t>
+            </w:r>
+            <w:proofErr w:type="spellEnd"/>
+            <w:r>
+              <w:rPr>
+                <w:szCs w:val="20"/>
+              </w:rPr>
+              <w:t>(</w:t>
+            </w:r>
+            <w:proofErr w:type="gramEnd"/>
+            <w:r>
+              <w:rPr>
+                <w:szCs w:val="20"/>
+              </w:rPr>
+              <w:t>30, 50)           # Dew Point Converter</w:t>
+            </w:r>
+          </w:p>
+          <w:p>
+            <w:pPr>
+              <w:rPr>
+                <w:szCs w:val="20"/>
+              </w:rPr>
+            </w:pPr>
+            <w:r>
+              <w:rPr>
+                <w:szCs w:val="20"/>
+              </w:rPr>
+              <w:t>18.46</w:t>
+            </w:r>
+          </w:p>
+          <w:p>
+            <w:pPr>
+              <w:rPr>
+                <w:szCs w:val="20"/>
+              </w:rPr>
+            </w:pPr>
+          </w:p>
+          <w:p>
+            <w:pPr>
+              <w:rPr>
+                <w:szCs w:val="20"/>
+              </w:rPr>
+            </w:pPr>
+            <w:r>
+              <w:rPr>
+                <w:szCs w:val="20"/>
+              </w:rPr>
+              <w:t xml:space="preserve">&gt;&gt;&gt; </w:t>
+            </w:r>
+            <w:proofErr w:type="spellStart"/>
+            <w:r>
+              <w:rPr>
+                <w:szCs w:val="20"/>
+              </w:rPr>
+              <w:t>dew_</w:t>
+            </w:r>
+            <w:proofErr w:type="gramStart"/>
+            <w:r>
+              <w:rPr>
+                <w:szCs w:val="20"/>
+              </w:rPr>
+              <w:t>point</w:t>
+            </w:r>
+            <w:proofErr w:type="spellEnd"/>
+            <w:r>
+              <w:rPr>
+                <w:szCs w:val="20"/>
+              </w:rPr>
+              <w:t>(</w:t>
+            </w:r>
+            <w:proofErr w:type="gramEnd"/>
+            <w:r>
+              <w:rPr>
+                <w:szCs w:val="20"/>
+              </w:rPr>
+              <w:t>30, 50, verbose=True)</w:t>
+            </w:r>
+          </w:p>
+          <w:p>
+            <w:pPr>
+              <w:rPr>
+                <w:szCs w:val="20"/>
+              </w:rPr>
+            </w:pPr>
+            <w:r>
+              <w:rPr>
+                <w:szCs w:val="20"/>
+              </w:rPr>
+              <w:t>(18.46, 'Caution: Somewhat uncomfortable for most people.')</w:t>
+            </w:r>
+          </w:p>
+          <w:p>
+            <w:pPr>
+              <w:rPr>
+                <w:rFonts w:ascii="Courier New" w:hAnsi="Courier New" w:cs="Courier New"/>
+                <w:sz w:val="18"/>
+                <w:szCs w:val="18"/>
+              </w:rPr>
+            </w:pPr>
+          </w:p>
+        </w:tc>
+      </w:tr>
+    </w:tbl>
+    <w:p>
+      <w:pPr>
         <w:rPr>
           <w:szCs w:val="20"/>
           <w:lang w:val="en"/>
         </w:rPr>
       </w:pPr>
-      <w:r>
+    </w:p>
+    <w:p>
+      <w:pPr>
         <w:rPr>
           <w:szCs w:val="20"/>
           <w:lang w:val="en"/>
         </w:rPr>
-        <w:br w:type="page"/>
-      </w:r>
+      </w:pPr>
+    </w:p>
+    <w:p>
+      <w:pPr>
+        <w:rPr>
+          <w:szCs w:val="20"/>
+          <w:lang w:val="en"/>
+        </w:rPr>
+      </w:pPr>
     </w:p>
     <w:tbl>
       <w:tblPr>
@@ -1892,6 +3074,7 @@
                 <w:lang w:val="en"/>
               </w:rPr>
             </w:pPr>
+            <w:proofErr w:type="spellStart"/>
             <w:r>
               <w:rPr>
                 <w:bCs/>
@@ -1900,7 +3083,6 @@
                 <w:color w:val="2E74B5" w:themeColor="accent5" w:themeShade="BF"/>
                 <w:lang w:val="en"/>
               </w:rPr>
-              <w:lastRenderedPageBreak/>
               <w:t>helper_</w:t>
             </w:r>
             <w:r>
@@ -1911,32 +3093,9 @@
                 <w:color w:val="2E74B5" w:themeColor="accent5" w:themeShade="BF"/>
                 <w:lang w:val="en"/>
               </w:rPr>
-              <w:t xml:space="preserve">class </w:t>
-            </w:r>
-            <w:r>
-              <w:rPr>
-                <w:bCs/>
-                <w:iCs/>
-                <w:lang w:val="en"/>
-              </w:rPr>
-              <w:t>temperature.</w:t>
-            </w:r>
-            <w:r>
-              <w:rPr>
-                <w:bCs/>
-                <w:iCs/>
-                <w:lang w:val="en"/>
-              </w:rPr>
-              <w:t>wind_chill</w:t>
-            </w:r>
-            <w:r>
-              <w:rPr>
-                <w:bCs/>
-                <w:color w:val="2E74B5" w:themeColor="accent5" w:themeShade="BF"/>
-                <w:lang w:val="en"/>
-              </w:rPr>
-              <w:t>(</w:t>
-            </w:r>
+              <w:t>class</w:t>
+            </w:r>
+            <w:proofErr w:type="spellEnd"/>
             <w:r>
               <w:rPr>
                 <w:bCs/>
@@ -1945,8 +3104,37 @@
                 <w:color w:val="2E74B5" w:themeColor="accent5" w:themeShade="BF"/>
                 <w:lang w:val="en"/>
               </w:rPr>
-              <w:t>d</w:t>
-            </w:r>
+              <w:t xml:space="preserve"> </w:t>
+            </w:r>
+            <w:proofErr w:type="spellStart"/>
+            <w:proofErr w:type="gramStart"/>
+            <w:r>
+              <w:rPr>
+                <w:bCs/>
+                <w:iCs/>
+                <w:lang w:val="en"/>
+              </w:rPr>
+              <w:t>temperature.wind</w:t>
+            </w:r>
+            <w:proofErr w:type="gramEnd"/>
+            <w:r>
+              <w:rPr>
+                <w:bCs/>
+                <w:iCs/>
+                <w:lang w:val="en"/>
+              </w:rPr>
+              <w:t>_chill</w:t>
+            </w:r>
+            <w:proofErr w:type="spellEnd"/>
+            <w:r>
+              <w:rPr>
+                <w:bCs/>
+                <w:color w:val="2E74B5" w:themeColor="accent5" w:themeShade="BF"/>
+                <w:lang w:val="en"/>
+              </w:rPr>
+              <w:t>(</w:t>
+            </w:r>
+            <w:proofErr w:type="spellStart"/>
             <w:r>
               <w:rPr>
                 <w:bCs/>
@@ -1955,7 +3143,7 @@
                 <w:color w:val="2E74B5" w:themeColor="accent5" w:themeShade="BF"/>
                 <w:lang w:val="en"/>
               </w:rPr>
-              <w:t>e</w:t>
+              <w:t>d</w:t>
             </w:r>
             <w:r>
               <w:rPr>
@@ -1965,7 +3153,7 @@
                 <w:color w:val="2E74B5" w:themeColor="accent5" w:themeShade="BF"/>
                 <w:lang w:val="en"/>
               </w:rPr>
-              <w:t>g_c,</w:t>
+              <w:t>e</w:t>
             </w:r>
             <w:r>
               <w:rPr>
@@ -1975,8 +3163,31 @@
                 <w:color w:val="2E74B5" w:themeColor="accent5" w:themeShade="BF"/>
                 <w:lang w:val="en"/>
               </w:rPr>
-              <w:t xml:space="preserve"> wind_vel_kmph</w:t>
-            </w:r>
+              <w:t>g_c</w:t>
+            </w:r>
+            <w:proofErr w:type="spellEnd"/>
+            <w:r>
+              <w:rPr>
+                <w:bCs/>
+                <w:i/>
+                <w:iCs/>
+                <w:color w:val="2E74B5" w:themeColor="accent5" w:themeShade="BF"/>
+                <w:lang w:val="en"/>
+              </w:rPr>
+              <w:t xml:space="preserve">, </w:t>
+            </w:r>
+            <w:proofErr w:type="spellStart"/>
+            <w:r>
+              <w:rPr>
+                <w:bCs/>
+                <w:i/>
+                <w:iCs/>
+                <w:color w:val="2E74B5" w:themeColor="accent5" w:themeShade="BF"/>
+                <w:lang w:val="en"/>
+              </w:rPr>
+              <w:t>wind_vel_kmph</w:t>
+            </w:r>
+            <w:proofErr w:type="spellEnd"/>
             <w:r>
               <w:rPr>
                 <w:bCs/>
@@ -2015,27 +3226,195 @@
       </w:pPr>
       <w:r>
         <w:rPr>
-          <w:lang w:val="en"/>
-        </w:rPr>
-        <w:t>Convert</w:t>
-      </w:r>
-      <w:r>
-        <w:rPr>
-          <w:lang w:val="en"/>
-        </w:rPr>
-        <w:t xml:space="preserve"> temperature and </w:t>
-      </w:r>
-      <w:r>
-        <w:rPr>
-          <w:lang w:val="en"/>
-        </w:rPr>
-        <w:t>wind velocity to a wind chill (“feels like”) tem</w:t>
-      </w:r>
-      <w:r>
-        <w:rPr>
-          <w:lang w:val="en"/>
-        </w:rPr>
-        <w:t>perature value and observation string</w:t>
+          <w:noProof/>
+        </w:rPr>
+        <mc:AlternateContent>
+          <mc:Choice Requires="wps">
+            <w:drawing>
+              <wp:anchor distT="0" distB="0" distL="114300" distR="114300" simplePos="0" relativeHeight="251665408" behindDoc="0" locked="0" layoutInCell="1" allowOverlap="1" wp14:anchorId="2CC4D087" wp14:editId="5A26D8EA">
+                <wp:simplePos x="0" y="0"/>
+                <wp:positionH relativeFrom="column">
+                  <wp:posOffset>973455</wp:posOffset>
+                </wp:positionH>
+                <wp:positionV relativeFrom="paragraph">
+                  <wp:posOffset>768571</wp:posOffset>
+                </wp:positionV>
+                <wp:extent cx="1828800" cy="1828800"/>
+                <wp:effectExtent l="0" t="781050" r="0" b="792480"/>
+                <wp:wrapNone/>
+                <wp:docPr id="3" name="Text Box 3"/>
+                <wp:cNvGraphicFramePr/>
+                <a:graphic xmlns:a="http://schemas.openxmlformats.org/drawingml/2006/main">
+                  <a:graphicData uri="http://schemas.microsoft.com/office/word/2010/wordprocessingShape">
+                    <wps:wsp>
+                      <wps:cNvSpPr txBox="1"/>
+                      <wps:spPr>
+                        <a:xfrm rot="20080743">
+                          <a:off x="0" y="0"/>
+                          <a:ext cx="1828800" cy="1828800"/>
+                        </a:xfrm>
+                        <a:prstGeom prst="rect">
+                          <a:avLst/>
+                        </a:prstGeom>
+                        <a:noFill/>
+                        <a:ln>
+                          <a:noFill/>
+                        </a:ln>
+                      </wps:spPr>
+                      <wps:txbx>
+                        <w:txbxContent>
+                          <w:p>
+                            <w:pPr>
+                              <w:jc w:val="center"/>
+                              <w:rPr>
+                                <w:b/>
+                                <w:outline/>
+                                <w:color w:val="5B9BD5" w:themeColor="accent5"/>
+                                <w:sz w:val="72"/>
+                                <w:szCs w:val="72"/>
+                                <w:lang w:val="en"/>
+                                <w14:shadow w14:blurRad="38100" w14:dist="22860" w14:dir="5400000" w14:sx="100000" w14:sy="100000" w14:kx="0" w14:ky="0" w14:algn="tl">
+                                  <w14:srgbClr w14:val="000000">
+                                    <w14:alpha w14:val="70000"/>
+                                  </w14:srgbClr>
+                                </w14:shadow>
+                                <w14:textOutline w14:w="10160" w14:cap="flat" w14:cmpd="sng" w14:algn="ctr">
+                                  <w14:solidFill>
+                                    <w14:schemeClr w14:val="accent5"/>
+                                  </w14:solidFill>
+                                  <w14:prstDash w14:val="solid"/>
+                                  <w14:round/>
+                                </w14:textOutline>
+                                <w14:textFill>
+                                  <w14:solidFill>
+                                    <w14:srgbClr w14:val="FFFFFF"/>
+                                  </w14:solidFill>
+                                </w14:textFill>
+                              </w:rPr>
+                            </w:pPr>
+                            <w:r>
+                              <w:rPr>
+                                <w:b/>
+                                <w:outline/>
+                                <w:color w:val="5B9BD5" w:themeColor="accent5"/>
+                                <w:sz w:val="72"/>
+                                <w:szCs w:val="72"/>
+                                <w:lang w:val="en"/>
+                                <w14:shadow w14:blurRad="38100" w14:dist="22860" w14:dir="5400000" w14:sx="100000" w14:sy="100000" w14:kx="0" w14:ky="0" w14:algn="tl">
+                                  <w14:srgbClr w14:val="000000">
+                                    <w14:alpha w14:val="70000"/>
+                                  </w14:srgbClr>
+                                </w14:shadow>
+                                <w14:textOutline w14:w="10160" w14:cap="flat" w14:cmpd="sng" w14:algn="ctr">
+                                  <w14:solidFill>
+                                    <w14:schemeClr w14:val="accent5"/>
+                                  </w14:solidFill>
+                                  <w14:prstDash w14:val="solid"/>
+                                  <w14:round/>
+                                </w14:textOutline>
+                                <w14:textFill>
+                                  <w14:solidFill>
+                                    <w14:srgbClr w14:val="FFFFFF"/>
+                                  </w14:solidFill>
+                                </w14:textFill>
+                              </w:rPr>
+                              <w:t>Under Development</w:t>
+                            </w:r>
+                          </w:p>
+                        </w:txbxContent>
+                      </wps:txbx>
+                      <wps:bodyPr rot="0" spcFirstLastPara="0" vertOverflow="overflow" horzOverflow="overflow" vert="horz" wrap="none" lIns="91440" tIns="45720" rIns="91440" bIns="45720" numCol="1" spcCol="0" rtlCol="0" fromWordArt="0" anchor="t" anchorCtr="0" forceAA="0" compatLnSpc="1">
+                        <a:prstTxWarp prst="textNoShape">
+                          <a:avLst/>
+                        </a:prstTxWarp>
+                        <a:spAutoFit/>
+                      </wps:bodyPr>
+                    </wps:wsp>
+                  </a:graphicData>
+                </a:graphic>
+              </wp:anchor>
+            </w:drawing>
+          </mc:Choice>
+          <mc:Fallback>
+            <w:pict>
+              <v:shapetype w14:anchorId="2CC4D087" id="_x0000_t202" coordsize="21600,21600" o:spt="202" path="m,l,21600r21600,l21600,xe">
+                <v:stroke joinstyle="miter"/>
+                <v:path gradientshapeok="t" o:connecttype="rect"/>
+              </v:shapetype>
+              <v:shape id="Text Box 3" o:spid="_x0000_s1026" type="#_x0000_t202" style="position:absolute;margin-left:76.65pt;margin-top:60.5pt;width:2in;height:2in;rotation:-1659434fd;z-index:251665408;visibility:visible;mso-wrap-style:none;mso-wrap-distance-left:9pt;mso-wrap-distance-top:0;mso-wrap-distance-right:9pt;mso-wrap-distance-bottom:0;mso-position-horizontal:absolute;mso-position-horizontal-relative:text;mso-position-vertical:absolute;mso-position-vertical-relative:text;v-text-anchor:top" o:gfxdata="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" filled="f" stroked="f">
+                <v:fill o:detectmouseclick="t"/>
+                <v:textbox style="mso-fit-shape-to-text:t">
+                  <w:txbxContent>
+                    <w:p>
+                      <w:pPr>
+                        <w:jc w:val="center"/>
+                        <w:rPr>
+                          <w:b/>
+                          <w:outline/>
+                          <w:color w:val="5B9BD5" w:themeColor="accent5"/>
+                          <w:sz w:val="72"/>
+                          <w:szCs w:val="72"/>
+                          <w:lang w:val="en"/>
+                          <w14:shadow w14:blurRad="38100" w14:dist="22860" w14:dir="5400000" w14:sx="100000" w14:sy="100000" w14:kx="0" w14:ky="0" w14:algn="tl">
+                            <w14:srgbClr w14:val="000000">
+                              <w14:alpha w14:val="70000"/>
+                            </w14:srgbClr>
+                          </w14:shadow>
+                          <w14:textOutline w14:w="10160" w14:cap="flat" w14:cmpd="sng" w14:algn="ctr">
+                            <w14:solidFill>
+                              <w14:schemeClr w14:val="accent5"/>
+                            </w14:solidFill>
+                            <w14:prstDash w14:val="solid"/>
+                            <w14:round/>
+                          </w14:textOutline>
+                          <w14:textFill>
+                            <w14:solidFill>
+                              <w14:srgbClr w14:val="FFFFFF"/>
+                            </w14:solidFill>
+                          </w14:textFill>
+                        </w:rPr>
+                      </w:pPr>
+                      <w:r>
+                        <w:rPr>
+                          <w:b/>
+                          <w:outline/>
+                          <w:color w:val="5B9BD5" w:themeColor="accent5"/>
+                          <w:sz w:val="72"/>
+                          <w:szCs w:val="72"/>
+                          <w:lang w:val="en"/>
+                          <w14:shadow w14:blurRad="38100" w14:dist="22860" w14:dir="5400000" w14:sx="100000" w14:sy="100000" w14:kx="0" w14:ky="0" w14:algn="tl">
+                            <w14:srgbClr w14:val="000000">
+                              <w14:alpha w14:val="70000"/>
+                            </w14:srgbClr>
+                          </w14:shadow>
+                          <w14:textOutline w14:w="10160" w14:cap="flat" w14:cmpd="sng" w14:algn="ctr">
+                            <w14:solidFill>
+                              <w14:schemeClr w14:val="accent5"/>
+                            </w14:solidFill>
+                            <w14:prstDash w14:val="solid"/>
+                            <w14:round/>
+                          </w14:textOutline>
+                          <w14:textFill>
+                            <w14:solidFill>
+                              <w14:srgbClr w14:val="FFFFFF"/>
+                            </w14:solidFill>
+                          </w14:textFill>
+                        </w:rPr>
+                        <w:t>Under Development</w:t>
+                      </w:r>
+                    </w:p>
+                  </w:txbxContent>
+                </v:textbox>
+              </v:shape>
+            </w:pict>
+          </mc:Fallback>
+        </mc:AlternateContent>
+      </w:r>
+      <w:r>
+        <w:rPr>
+          <w:lang w:val="en"/>
+        </w:rPr>
+        <w:t>Convert temperature and wind velocity to a wind chill (“feels like”) temperature value and observation string</w:t>
       </w:r>
       <w:r>
         <w:rPr>
@@ -2047,32 +3426,16 @@
         <w:rPr>
           <w:lang w:val="en"/>
         </w:rPr>
-        <w:t xml:space="preserve"> Temperature input value is degrees Celsius in the range of -99 to 99 degrees. </w:t>
-      </w:r>
-      <w:r>
-        <w:rPr>
-          <w:lang w:val="en"/>
-        </w:rPr>
-        <w:t>Wind velocity is kilometers-per-hour in the range of 0 to 100</w:t>
-      </w:r>
-      <w:r>
-        <w:rPr>
-          <w:lang w:val="en"/>
-        </w:rPr>
-        <w:t xml:space="preserve">. Returns a </w:t>
-      </w:r>
-      <w:r>
-        <w:rPr>
-          <w:lang w:val="en"/>
-        </w:rPr>
-        <w:t>wind chill</w:t>
-      </w:r>
-      <w:r>
-        <w:rPr>
-          <w:lang w:val="en"/>
-        </w:rPr>
-        <w:t xml:space="preserve"> value in degrees Celsius and an observation string (if verbose is True) .</w:t>
-      </w:r>
+        <w:t xml:space="preserve"> Temperature input value is degrees Celsius in the range of -99 to 99 degrees. Wind velocity is kilometers-per-hour in the range of 0 to 100. Returns a wind chill value in degrees Celsius and an observation string (if verbose is True</w:t>
+      </w:r>
+      <w:proofErr w:type="gramStart"/>
+      <w:r>
+        <w:rPr>
+          <w:lang w:val="en"/>
+        </w:rPr>
+        <w:t>) .</w:t>
+      </w:r>
+      <w:proofErr w:type="gramEnd"/>
     </w:p>
     <w:tbl>
       <w:tblPr>
@@ -2145,7 +3508,15 @@
               <w:t xml:space="preserve"> – </w:t>
             </w:r>
             <w:r>
-              <w:t>The temperature input value. Can be any positive or negative numeric value in the range of -99 to 99. No default value.</w:t>
+              <w:t xml:space="preserve">The temperature input value. Can be any positive or negative numeric value in the range of -99 to 99. No default </w:t>
+            </w:r>
+            <w:proofErr w:type="gramStart"/>
+            <w:r>
+              <w:t>value</w:t>
+            </w:r>
+            <w:proofErr w:type="gramEnd"/>
+            <w:r>
+              <w:t>.</w:t>
             </w:r>
           </w:p>
           <w:p>
@@ -2163,18 +3534,237 @@
               <w:t>Wind Velocity</w:t>
             </w:r>
             <w:r>
-              <w:t xml:space="preserve"> – The </w:t>
-            </w:r>
-            <w:r>
-              <w:t>wind velocity</w:t>
-            </w:r>
-            <w:r>
-              <w:t xml:space="preserve"> input value. Can be any positive value in the range of 0 to 100. No default value.</w:t>
+              <w:t xml:space="preserve"> – The wind velocity input value. Can be any positive value in the range of 0 to 100. No default </w:t>
+            </w:r>
+            <w:proofErr w:type="gramStart"/>
+            <w:r>
+              <w:t>value</w:t>
+            </w:r>
+            <w:proofErr w:type="gramEnd"/>
+            <w:r>
+              <w:t>.</w:t>
             </w:r>
           </w:p>
         </w:tc>
       </w:tr>
     </w:tbl>
+    <w:p>
+      <w:pPr>
+        <w:rPr>
+          <w:szCs w:val="20"/>
+          <w:lang w:val="en"/>
+        </w:rPr>
+      </w:pPr>
+    </w:p>
+    <w:p>
+      <w:pPr>
+        <w:pStyle w:val="Heading3"/>
+        <w:rPr>
+          <w:lang w:val="en"/>
+        </w:rPr>
+      </w:pPr>
+      <w:r>
+        <w:rPr>
+          <w:lang w:val="en"/>
+        </w:rPr>
+        <w:t>Example:</w:t>
+      </w:r>
+    </w:p>
+    <w:tbl>
+      <w:tblPr>
+        <w:tblStyle w:val="TableGrid"/>
+        <w:tblW w:w="8118" w:type="dxa"/>
+        <w:jc w:val="center"/>
+        <w:tblBorders>
+          <w:top w:val="single" w:sz="24" w:space="0" w:color="9CC2E5" w:themeColor="accent5" w:themeTint="99"/>
+          <w:left w:val="none" w:sz="0" w:space="0" w:color="auto"/>
+          <w:bottom w:val="none" w:sz="0" w:space="0" w:color="auto"/>
+          <w:right w:val="none" w:sz="0" w:space="0" w:color="auto"/>
+          <w:insideH w:val="none" w:sz="0" w:space="0" w:color="auto"/>
+          <w:insideV w:val="none" w:sz="0" w:space="0" w:color="auto"/>
+        </w:tblBorders>
+        <w:shd w:val="clear" w:color="auto" w:fill="E2EFD9" w:themeFill="accent6" w:themeFillTint="33"/>
+        <w:tblLook w:val="04A0" w:firstRow="1" w:lastRow="0" w:firstColumn="1" w:lastColumn="0" w:noHBand="0" w:noVBand="1"/>
+      </w:tblPr>
+      <w:tblGrid>
+        <w:gridCol w:w="8118"/>
+      </w:tblGrid>
+      <w:tr>
+        <w:trPr>
+          <w:jc w:val="center"/>
+        </w:trPr>
+        <w:tc>
+          <w:tcPr>
+            <w:tcW w:w="8118" w:type="dxa"/>
+            <w:tcBorders>
+              <w:top w:val="double" w:sz="4" w:space="0" w:color="70AD47" w:themeColor="accent6"/>
+              <w:left w:val="double" w:sz="4" w:space="0" w:color="70AD47" w:themeColor="accent6"/>
+              <w:bottom w:val="double" w:sz="4" w:space="0" w:color="70AD47" w:themeColor="accent6"/>
+              <w:right w:val="double" w:sz="4" w:space="0" w:color="70AD47" w:themeColor="accent6"/>
+            </w:tcBorders>
+            <w:shd w:val="clear" w:color="auto" w:fill="E2EFD9" w:themeFill="accent6" w:themeFillTint="33"/>
+          </w:tcPr>
+          <w:p>
+            <w:pPr>
+              <w:autoSpaceDE w:val="0"/>
+              <w:autoSpaceDN w:val="0"/>
+              <w:adjustRightInd w:val="0"/>
+              <w:rPr>
+                <w:rFonts w:ascii="Courier New" w:hAnsi="Courier New" w:cs="Courier New"/>
+                <w:sz w:val="18"/>
+                <w:szCs w:val="18"/>
+              </w:rPr>
+            </w:pPr>
+          </w:p>
+          <w:p>
+            <w:pPr>
+              <w:rPr>
+                <w:szCs w:val="20"/>
+              </w:rPr>
+            </w:pPr>
+            <w:r>
+              <w:rPr>
+                <w:szCs w:val="20"/>
+              </w:rPr>
+              <w:t xml:space="preserve">&gt;&gt;&gt; from </w:t>
+            </w:r>
+            <w:proofErr w:type="spellStart"/>
+            <w:r>
+              <w:rPr>
+                <w:szCs w:val="20"/>
+              </w:rPr>
+              <w:t>cedargrove_unit_</w:t>
+            </w:r>
+            <w:proofErr w:type="gramStart"/>
+            <w:r>
+              <w:rPr>
+                <w:szCs w:val="20"/>
+              </w:rPr>
+              <w:t>converter.temperature</w:t>
+            </w:r>
+            <w:proofErr w:type="spellEnd"/>
+            <w:proofErr w:type="gramEnd"/>
+            <w:r>
+              <w:rPr>
+                <w:szCs w:val="20"/>
+              </w:rPr>
+              <w:t xml:space="preserve"> import </w:t>
+            </w:r>
+            <w:proofErr w:type="spellStart"/>
+            <w:r>
+              <w:rPr>
+                <w:szCs w:val="20"/>
+              </w:rPr>
+              <w:t>wind_chill</w:t>
+            </w:r>
+            <w:proofErr w:type="spellEnd"/>
+          </w:p>
+          <w:p>
+            <w:pPr>
+              <w:rPr>
+                <w:szCs w:val="20"/>
+              </w:rPr>
+            </w:pPr>
+            <w:r>
+              <w:rPr>
+                <w:szCs w:val="20"/>
+              </w:rPr>
+              <w:t xml:space="preserve">&gt;&gt;&gt; </w:t>
+            </w:r>
+            <w:proofErr w:type="spellStart"/>
+            <w:r>
+              <w:rPr>
+                <w:szCs w:val="20"/>
+              </w:rPr>
+              <w:t>wind_</w:t>
+            </w:r>
+            <w:proofErr w:type="gramStart"/>
+            <w:r>
+              <w:rPr>
+                <w:szCs w:val="20"/>
+              </w:rPr>
+              <w:t>chill</w:t>
+            </w:r>
+            <w:proofErr w:type="spellEnd"/>
+            <w:r>
+              <w:rPr>
+                <w:szCs w:val="20"/>
+              </w:rPr>
+              <w:t>(</w:t>
+            </w:r>
+            <w:proofErr w:type="spellStart"/>
+            <w:proofErr w:type="gramEnd"/>
+            <w:r>
+              <w:rPr>
+                <w:szCs w:val="20"/>
+              </w:rPr>
+              <w:t>tt</w:t>
+            </w:r>
+            <w:proofErr w:type="spellEnd"/>
+            <w:r>
+              <w:rPr>
+                <w:szCs w:val="20"/>
+              </w:rPr>
+              <w:t xml:space="preserve">, </w:t>
+            </w:r>
+            <w:proofErr w:type="spellStart"/>
+            <w:r>
+              <w:rPr>
+                <w:szCs w:val="20"/>
+              </w:rPr>
+              <w:t>ww</w:t>
+            </w:r>
+            <w:proofErr w:type="spellEnd"/>
+            <w:r>
+              <w:rPr>
+                <w:szCs w:val="20"/>
+              </w:rPr>
+              <w:t>)  # Wind Chill Converter (_under development_)</w:t>
+            </w:r>
+          </w:p>
+          <w:p>
+            <w:pPr>
+              <w:rPr>
+                <w:szCs w:val="20"/>
+              </w:rPr>
+            </w:pPr>
+            <w:proofErr w:type="spellStart"/>
+            <w:r>
+              <w:rPr>
+                <w:szCs w:val="20"/>
+              </w:rPr>
+              <w:t>wcwcwcwcwc</w:t>
+            </w:r>
+            <w:proofErr w:type="spellEnd"/>
+          </w:p>
+          <w:p>
+            <w:pPr>
+              <w:rPr>
+                <w:rFonts w:ascii="Courier New" w:hAnsi="Courier New" w:cs="Courier New"/>
+                <w:sz w:val="18"/>
+                <w:szCs w:val="18"/>
+              </w:rPr>
+            </w:pPr>
+          </w:p>
+        </w:tc>
+      </w:tr>
+    </w:tbl>
+    <w:p>
+      <w:pPr>
+        <w:rPr>
+          <w:szCs w:val="20"/>
+          <w:lang w:val="en"/>
+        </w:rPr>
+      </w:pPr>
+    </w:p>
+    <w:p>
+      <w:pPr>
+        <w:rPr>
+          <w:szCs w:val="20"/>
+          <w:lang w:val="en"/>
+        </w:rPr>
+      </w:pPr>
+    </w:p>
     <w:p>
       <w:pPr>
         <w:rPr>
@@ -2215,6 +3805,7 @@
                 <w:lang w:val="en"/>
               </w:rPr>
             </w:pPr>
+            <w:proofErr w:type="spellStart"/>
             <w:r>
               <w:rPr>
                 <w:bCs/>
@@ -2233,32 +3824,9 @@
                 <w:color w:val="2E74B5" w:themeColor="accent5" w:themeShade="BF"/>
                 <w:lang w:val="en"/>
               </w:rPr>
-              <w:t xml:space="preserve">class </w:t>
-            </w:r>
-            <w:r>
-              <w:rPr>
-                <w:bCs/>
-                <w:iCs/>
-                <w:lang w:val="en"/>
-              </w:rPr>
-              <w:t>temperature.</w:t>
-            </w:r>
-            <w:r>
-              <w:rPr>
-                <w:bCs/>
-                <w:iCs/>
-                <w:lang w:val="en"/>
-              </w:rPr>
-              <w:t>apparent_temperature</w:t>
-            </w:r>
-            <w:r>
-              <w:rPr>
-                <w:bCs/>
-                <w:color w:val="2E74B5" w:themeColor="accent5" w:themeShade="BF"/>
-                <w:lang w:val="en"/>
-              </w:rPr>
-              <w:t>(</w:t>
-            </w:r>
+              <w:t>class</w:t>
+            </w:r>
+            <w:proofErr w:type="spellEnd"/>
             <w:r>
               <w:rPr>
                 <w:bCs/>
@@ -2267,8 +3835,37 @@
                 <w:color w:val="2E74B5" w:themeColor="accent5" w:themeShade="BF"/>
                 <w:lang w:val="en"/>
               </w:rPr>
-              <w:t>d</w:t>
-            </w:r>
+              <w:t xml:space="preserve"> </w:t>
+            </w:r>
+            <w:proofErr w:type="spellStart"/>
+            <w:proofErr w:type="gramStart"/>
+            <w:r>
+              <w:rPr>
+                <w:bCs/>
+                <w:iCs/>
+                <w:lang w:val="en"/>
+              </w:rPr>
+              <w:t>temperature.apparent</w:t>
+            </w:r>
+            <w:proofErr w:type="gramEnd"/>
+            <w:r>
+              <w:rPr>
+                <w:bCs/>
+                <w:iCs/>
+                <w:lang w:val="en"/>
+              </w:rPr>
+              <w:t>_temperature</w:t>
+            </w:r>
+            <w:proofErr w:type="spellEnd"/>
+            <w:r>
+              <w:rPr>
+                <w:bCs/>
+                <w:color w:val="2E74B5" w:themeColor="accent5" w:themeShade="BF"/>
+                <w:lang w:val="en"/>
+              </w:rPr>
+              <w:t>(</w:t>
+            </w:r>
+            <w:proofErr w:type="spellStart"/>
             <w:r>
               <w:rPr>
                 <w:bCs/>
@@ -2277,7 +3874,7 @@
                 <w:color w:val="2E74B5" w:themeColor="accent5" w:themeShade="BF"/>
                 <w:lang w:val="en"/>
               </w:rPr>
-              <w:t>e</w:t>
+              <w:t>d</w:t>
             </w:r>
             <w:r>
               <w:rPr>
@@ -2287,7 +3884,7 @@
                 <w:color w:val="2E74B5" w:themeColor="accent5" w:themeShade="BF"/>
                 <w:lang w:val="en"/>
               </w:rPr>
-              <w:t xml:space="preserve">g_c, </w:t>
+              <w:t>e</w:t>
             </w:r>
             <w:r>
               <w:rPr>
@@ -2297,8 +3894,9 @@
                 <w:color w:val="2E74B5" w:themeColor="accent5" w:themeShade="BF"/>
                 <w:lang w:val="en"/>
               </w:rPr>
-              <w:t xml:space="preserve">humidity, </w:t>
-            </w:r>
+              <w:t>g_c</w:t>
+            </w:r>
+            <w:proofErr w:type="spellEnd"/>
             <w:r>
               <w:rPr>
                 <w:bCs/>
@@ -2307,7 +3905,29 @@
                 <w:color w:val="2E74B5" w:themeColor="accent5" w:themeShade="BF"/>
                 <w:lang w:val="en"/>
               </w:rPr>
-              <w:t>wind_vel_kmph, verbose=False</w:t>
+              <w:t xml:space="preserve">, humidity, </w:t>
+            </w:r>
+            <w:proofErr w:type="spellStart"/>
+            <w:r>
+              <w:rPr>
+                <w:bCs/>
+                <w:i/>
+                <w:iCs/>
+                <w:color w:val="2E74B5" w:themeColor="accent5" w:themeShade="BF"/>
+                <w:lang w:val="en"/>
+              </w:rPr>
+              <w:t>wind_vel_kmph</w:t>
+            </w:r>
+            <w:proofErr w:type="spellEnd"/>
+            <w:r>
+              <w:rPr>
+                <w:bCs/>
+                <w:i/>
+                <w:iCs/>
+                <w:color w:val="2E74B5" w:themeColor="accent5" w:themeShade="BF"/>
+                <w:lang w:val="en"/>
+              </w:rPr>
+              <w:t>, verbose=False</w:t>
             </w:r>
             <w:r>
               <w:rPr>
@@ -2337,47 +3957,191 @@
       </w:pPr>
       <w:r>
         <w:rPr>
-          <w:lang w:val="en"/>
-        </w:rPr>
-        <w:t>Convert temperature</w:t>
-      </w:r>
-      <w:r>
-        <w:rPr>
-          <w:lang w:val="en"/>
-        </w:rPr>
-        <w:t>, humidity,</w:t>
-      </w:r>
-      <w:r>
-        <w:rPr>
-          <w:lang w:val="en"/>
-        </w:rPr>
-        <w:t xml:space="preserve"> and wind velocity to a</w:t>
-      </w:r>
-      <w:r>
-        <w:rPr>
-          <w:lang w:val="en"/>
-        </w:rPr>
-        <w:t>n apparent</w:t>
-      </w:r>
-      <w:r>
-        <w:rPr>
-          <w:lang w:val="en"/>
-        </w:rPr>
-        <w:t xml:space="preserve"> temperature</w:t>
-      </w:r>
-      <w:r>
-        <w:rPr>
-          <w:lang w:val="en"/>
-        </w:rPr>
-        <w:t xml:space="preserve"> (AT) thermal sensation</w:t>
-      </w:r>
-      <w:bookmarkStart w:id="0" w:name="_GoBack"/>
-      <w:bookmarkEnd w:id="0"/>
-      <w:r>
-        <w:rPr>
-          <w:lang w:val="en"/>
-        </w:rPr>
-        <w:t xml:space="preserve"> value and observation string</w:t>
+          <w:noProof/>
+        </w:rPr>
+        <mc:AlternateContent>
+          <mc:Choice Requires="wps">
+            <w:drawing>
+              <wp:anchor distT="0" distB="0" distL="114300" distR="114300" simplePos="0" relativeHeight="251663360" behindDoc="0" locked="0" layoutInCell="1" allowOverlap="1" wp14:anchorId="3FB4A337" wp14:editId="1CCCEDFC">
+                <wp:simplePos x="0" y="0"/>
+                <wp:positionH relativeFrom="column">
+                  <wp:posOffset>973648</wp:posOffset>
+                </wp:positionH>
+                <wp:positionV relativeFrom="paragraph">
+                  <wp:posOffset>751150</wp:posOffset>
+                </wp:positionV>
+                <wp:extent cx="1828800" cy="1828800"/>
+                <wp:effectExtent l="0" t="781050" r="0" b="792480"/>
+                <wp:wrapNone/>
+                <wp:docPr id="2" name="Text Box 2"/>
+                <wp:cNvGraphicFramePr/>
+                <a:graphic xmlns:a="http://schemas.openxmlformats.org/drawingml/2006/main">
+                  <a:graphicData uri="http://schemas.microsoft.com/office/word/2010/wordprocessingShape">
+                    <wps:wsp>
+                      <wps:cNvSpPr txBox="1"/>
+                      <wps:spPr>
+                        <a:xfrm rot="20080743">
+                          <a:off x="0" y="0"/>
+                          <a:ext cx="1828800" cy="1828800"/>
+                        </a:xfrm>
+                        <a:prstGeom prst="rect">
+                          <a:avLst/>
+                        </a:prstGeom>
+                        <a:noFill/>
+                        <a:ln>
+                          <a:noFill/>
+                        </a:ln>
+                      </wps:spPr>
+                      <wps:txbx>
+                        <w:txbxContent>
+                          <w:p>
+                            <w:pPr>
+                              <w:jc w:val="center"/>
+                              <w:rPr>
+                                <w:b/>
+                                <w:outline/>
+                                <w:color w:val="5B9BD5" w:themeColor="accent5"/>
+                                <w:sz w:val="72"/>
+                                <w:szCs w:val="72"/>
+                                <w:lang w:val="en"/>
+                                <w14:shadow w14:blurRad="38100" w14:dist="22860" w14:dir="5400000" w14:sx="100000" w14:sy="100000" w14:kx="0" w14:ky="0" w14:algn="tl">
+                                  <w14:srgbClr w14:val="000000">
+                                    <w14:alpha w14:val="70000"/>
+                                  </w14:srgbClr>
+                                </w14:shadow>
+                                <w14:textOutline w14:w="10160" w14:cap="flat" w14:cmpd="sng" w14:algn="ctr">
+                                  <w14:solidFill>
+                                    <w14:schemeClr w14:val="accent5"/>
+                                  </w14:solidFill>
+                                  <w14:prstDash w14:val="solid"/>
+                                  <w14:round/>
+                                </w14:textOutline>
+                                <w14:textFill>
+                                  <w14:solidFill>
+                                    <w14:srgbClr w14:val="FFFFFF"/>
+                                  </w14:solidFill>
+                                </w14:textFill>
+                              </w:rPr>
+                            </w:pPr>
+                            <w:r>
+                              <w:rPr>
+                                <w:b/>
+                                <w:outline/>
+                                <w:color w:val="5B9BD5" w:themeColor="accent5"/>
+                                <w:sz w:val="72"/>
+                                <w:szCs w:val="72"/>
+                                <w:lang w:val="en"/>
+                                <w14:shadow w14:blurRad="38100" w14:dist="22860" w14:dir="5400000" w14:sx="100000" w14:sy="100000" w14:kx="0" w14:ky="0" w14:algn="tl">
+                                  <w14:srgbClr w14:val="000000">
+                                    <w14:alpha w14:val="70000"/>
+                                  </w14:srgbClr>
+                                </w14:shadow>
+                                <w14:textOutline w14:w="10160" w14:cap="flat" w14:cmpd="sng" w14:algn="ctr">
+                                  <w14:solidFill>
+                                    <w14:schemeClr w14:val="accent5"/>
+                                  </w14:solidFill>
+                                  <w14:prstDash w14:val="solid"/>
+                                  <w14:round/>
+                                </w14:textOutline>
+                                <w14:textFill>
+                                  <w14:solidFill>
+                                    <w14:srgbClr w14:val="FFFFFF"/>
+                                  </w14:solidFill>
+                                </w14:textFill>
+                              </w:rPr>
+                              <w:t>Under Development</w:t>
+                            </w:r>
+                          </w:p>
+                        </w:txbxContent>
+                      </wps:txbx>
+                      <wps:bodyPr rot="0" spcFirstLastPara="0" vertOverflow="overflow" horzOverflow="overflow" vert="horz" wrap="none" lIns="91440" tIns="45720" rIns="91440" bIns="45720" numCol="1" spcCol="0" rtlCol="0" fromWordArt="0" anchor="t" anchorCtr="0" forceAA="0" compatLnSpc="1">
+                        <a:prstTxWarp prst="textNoShape">
+                          <a:avLst/>
+                        </a:prstTxWarp>
+                        <a:spAutoFit/>
+                      </wps:bodyPr>
+                    </wps:wsp>
+                  </a:graphicData>
+                </a:graphic>
+              </wp:anchor>
+            </w:drawing>
+          </mc:Choice>
+          <mc:Fallback>
+            <w:pict>
+              <v:shape w14:anchorId="3FB4A337" id="Text Box 2" o:spid="_x0000_s1027" type="#_x0000_t202" style="position:absolute;margin-left:76.65pt;margin-top:59.15pt;width:2in;height:2in;rotation:-1659434fd;z-index:251663360;visibility:visible;mso-wrap-style:none;mso-wrap-distance-left:9pt;mso-wrap-distance-top:0;mso-wrap-distance-right:9pt;mso-wrap-distance-bottom:0;mso-position-horizontal:absolute;mso-position-horizontal-relative:text;mso-position-vertical:absolute;mso-position-vertical-relative:text;v-text-anchor:top" o:gfxdata="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" filled="f" stroked="f">
+                <v:fill o:detectmouseclick="t"/>
+                <v:textbox style="mso-fit-shape-to-text:t">
+                  <w:txbxContent>
+                    <w:p>
+                      <w:pPr>
+                        <w:jc w:val="center"/>
+                        <w:rPr>
+                          <w:b/>
+                          <w:outline/>
+                          <w:color w:val="5B9BD5" w:themeColor="accent5"/>
+                          <w:sz w:val="72"/>
+                          <w:szCs w:val="72"/>
+                          <w:lang w:val="en"/>
+                          <w14:shadow w14:blurRad="38100" w14:dist="22860" w14:dir="5400000" w14:sx="100000" w14:sy="100000" w14:kx="0" w14:ky="0" w14:algn="tl">
+                            <w14:srgbClr w14:val="000000">
+                              <w14:alpha w14:val="70000"/>
+                            </w14:srgbClr>
+                          </w14:shadow>
+                          <w14:textOutline w14:w="10160" w14:cap="flat" w14:cmpd="sng" w14:algn="ctr">
+                            <w14:solidFill>
+                              <w14:schemeClr w14:val="accent5"/>
+                            </w14:solidFill>
+                            <w14:prstDash w14:val="solid"/>
+                            <w14:round/>
+                          </w14:textOutline>
+                          <w14:textFill>
+                            <w14:solidFill>
+                              <w14:srgbClr w14:val="FFFFFF"/>
+                            </w14:solidFill>
+                          </w14:textFill>
+                        </w:rPr>
+                      </w:pPr>
+                      <w:r>
+                        <w:rPr>
+                          <w:b/>
+                          <w:outline/>
+                          <w:color w:val="5B9BD5" w:themeColor="accent5"/>
+                          <w:sz w:val="72"/>
+                          <w:szCs w:val="72"/>
+                          <w:lang w:val="en"/>
+                          <w14:shadow w14:blurRad="38100" w14:dist="22860" w14:dir="5400000" w14:sx="100000" w14:sy="100000" w14:kx="0" w14:ky="0" w14:algn="tl">
+                            <w14:srgbClr w14:val="000000">
+                              <w14:alpha w14:val="70000"/>
+                            </w14:srgbClr>
+                          </w14:shadow>
+                          <w14:textOutline w14:w="10160" w14:cap="flat" w14:cmpd="sng" w14:algn="ctr">
+                            <w14:solidFill>
+                              <w14:schemeClr w14:val="accent5"/>
+                            </w14:solidFill>
+                            <w14:prstDash w14:val="solid"/>
+                            <w14:round/>
+                          </w14:textOutline>
+                          <w14:textFill>
+                            <w14:solidFill>
+                              <w14:srgbClr w14:val="FFFFFF"/>
+                            </w14:solidFill>
+                          </w14:textFill>
+                        </w:rPr>
+                        <w:t>Under Development</w:t>
+                      </w:r>
+                    </w:p>
+                  </w:txbxContent>
+                </v:textbox>
+              </v:shape>
+            </w:pict>
+          </mc:Fallback>
+        </mc:AlternateContent>
+      </w:r>
+      <w:r>
+        <w:rPr>
+          <w:lang w:val="en"/>
+        </w:rPr>
+        <w:t>Convert temperature, humidity, and wind velocity to an apparent temperature (AT) thermal sensation value and observation string</w:t>
       </w:r>
       <w:r>
         <w:rPr>
@@ -2389,20 +4153,16 @@
         <w:rPr>
           <w:lang w:val="en"/>
         </w:rPr>
-        <w:t xml:space="preserve"> Temperature input value is degrees Celsius in the range of -99 to 99 degrees. Humidity input value is percent humidity in the range of 0 to 100. Wind velocity is kilometers-per-hour in the range of 0 to 100. Returns a</w:t>
-      </w:r>
-      <w:r>
-        <w:rPr>
-          <w:lang w:val="en"/>
-        </w:rPr>
-        <w:t>n apparent temperature</w:t>
-      </w:r>
-      <w:r>
-        <w:rPr>
-          <w:lang w:val="en"/>
-        </w:rPr>
-        <w:t xml:space="preserve"> value in degrees Celsius and an observation string (if verbose is True) .</w:t>
-      </w:r>
+        <w:t xml:space="preserve"> Temperature input value is degrees Celsius in the range of -99 to 99 degrees. Humidity input value is percent humidity in the range of 0 to 100. Wind velocity is kilometers-per-hour in the range of 0 to 100. Returns an apparent temperature value in degrees Celsius and an observation string (if verbose is True</w:t>
+      </w:r>
+      <w:proofErr w:type="gramStart"/>
+      <w:r>
+        <w:rPr>
+          <w:lang w:val="en"/>
+        </w:rPr>
+        <w:t>) .</w:t>
+      </w:r>
+      <w:proofErr w:type="gramEnd"/>
     </w:p>
     <w:tbl>
       <w:tblPr>
@@ -2475,7 +4235,15 @@
               <w:t xml:space="preserve"> – </w:t>
             </w:r>
             <w:r>
-              <w:t>The temperature input value. Can be any positive or negative numeric value in the range of -99 to 99. No default value.</w:t>
+              <w:t xml:space="preserve">The temperature input value. Can be any positive or negative numeric value in the range of -99 to 99. No default </w:t>
+            </w:r>
+            <w:proofErr w:type="gramStart"/>
+            <w:r>
+              <w:t>value</w:t>
+            </w:r>
+            <w:proofErr w:type="gramEnd"/>
+            <w:r>
+              <w:t>.</w:t>
             </w:r>
           </w:p>
           <w:p>
@@ -2493,7 +4261,15 @@
               <w:t>Humidity</w:t>
             </w:r>
             <w:r>
-              <w:t xml:space="preserve"> – The humidity percent input value. Can be any positive value in the range of 0 to 100. No default value.</w:t>
+              <w:t xml:space="preserve"> – The humidity percent input value. Can be any positive value in the range of 0 to 100. No default </w:t>
+            </w:r>
+            <w:proofErr w:type="gramStart"/>
+            <w:r>
+              <w:t>value</w:t>
+            </w:r>
+            <w:proofErr w:type="gramEnd"/>
+            <w:r>
+              <w:t>.</w:t>
             </w:r>
           </w:p>
           <w:p>
@@ -2511,12 +4287,244 @@
               <w:t>Wind Velocity</w:t>
             </w:r>
             <w:r>
-              <w:t xml:space="preserve"> – The wind velocity input value. Can be any positive value in the range of 0 to 100. No default value.</w:t>
+              <w:t xml:space="preserve"> – The wind velocity input value. Can be any positive value in the range of 0 to 100. No default </w:t>
+            </w:r>
+            <w:proofErr w:type="gramStart"/>
+            <w:r>
+              <w:t>value</w:t>
+            </w:r>
+            <w:proofErr w:type="gramEnd"/>
+            <w:r>
+              <w:t>.</w:t>
             </w:r>
           </w:p>
         </w:tc>
       </w:tr>
     </w:tbl>
+    <w:p>
+      <w:pPr>
+        <w:rPr>
+          <w:szCs w:val="20"/>
+          <w:lang w:val="en"/>
+        </w:rPr>
+      </w:pPr>
+    </w:p>
+    <w:p>
+      <w:pPr>
+        <w:pStyle w:val="Heading3"/>
+        <w:rPr>
+          <w:lang w:val="en"/>
+        </w:rPr>
+      </w:pPr>
+      <w:r>
+        <w:rPr>
+          <w:lang w:val="en"/>
+        </w:rPr>
+        <w:lastRenderedPageBreak/>
+        <w:t>Example:</w:t>
+      </w:r>
+    </w:p>
+    <w:tbl>
+      <w:tblPr>
+        <w:tblStyle w:val="TableGrid"/>
+        <w:tblW w:w="8118" w:type="dxa"/>
+        <w:jc w:val="center"/>
+        <w:tblBorders>
+          <w:top w:val="single" w:sz="24" w:space="0" w:color="9CC2E5" w:themeColor="accent5" w:themeTint="99"/>
+          <w:left w:val="none" w:sz="0" w:space="0" w:color="auto"/>
+          <w:bottom w:val="none" w:sz="0" w:space="0" w:color="auto"/>
+          <w:right w:val="none" w:sz="0" w:space="0" w:color="auto"/>
+          <w:insideH w:val="none" w:sz="0" w:space="0" w:color="auto"/>
+          <w:insideV w:val="none" w:sz="0" w:space="0" w:color="auto"/>
+        </w:tblBorders>
+        <w:shd w:val="clear" w:color="auto" w:fill="E2EFD9" w:themeFill="accent6" w:themeFillTint="33"/>
+        <w:tblLook w:val="04A0" w:firstRow="1" w:lastRow="0" w:firstColumn="1" w:lastColumn="0" w:noHBand="0" w:noVBand="1"/>
+      </w:tblPr>
+      <w:tblGrid>
+        <w:gridCol w:w="8118"/>
+      </w:tblGrid>
+      <w:tr>
+        <w:trPr>
+          <w:jc w:val="center"/>
+        </w:trPr>
+        <w:tc>
+          <w:tcPr>
+            <w:tcW w:w="8118" w:type="dxa"/>
+            <w:tcBorders>
+              <w:top w:val="double" w:sz="4" w:space="0" w:color="70AD47" w:themeColor="accent6"/>
+              <w:left w:val="double" w:sz="4" w:space="0" w:color="70AD47" w:themeColor="accent6"/>
+              <w:bottom w:val="double" w:sz="4" w:space="0" w:color="70AD47" w:themeColor="accent6"/>
+              <w:right w:val="double" w:sz="4" w:space="0" w:color="70AD47" w:themeColor="accent6"/>
+            </w:tcBorders>
+            <w:shd w:val="clear" w:color="auto" w:fill="E2EFD9" w:themeFill="accent6" w:themeFillTint="33"/>
+          </w:tcPr>
+          <w:p>
+            <w:pPr>
+              <w:autoSpaceDE w:val="0"/>
+              <w:autoSpaceDN w:val="0"/>
+              <w:adjustRightInd w:val="0"/>
+              <w:rPr>
+                <w:rFonts w:ascii="Courier New" w:hAnsi="Courier New" w:cs="Courier New"/>
+                <w:sz w:val="18"/>
+                <w:szCs w:val="18"/>
+              </w:rPr>
+            </w:pPr>
+          </w:p>
+          <w:p>
+            <w:pPr>
+              <w:rPr>
+                <w:szCs w:val="20"/>
+              </w:rPr>
+            </w:pPr>
+            <w:r>
+              <w:rPr>
+                <w:szCs w:val="20"/>
+              </w:rPr>
+              <w:t xml:space="preserve">&gt;&gt;&gt; from </w:t>
+            </w:r>
+            <w:proofErr w:type="spellStart"/>
+            <w:r>
+              <w:rPr>
+                <w:szCs w:val="20"/>
+              </w:rPr>
+              <w:t>cedargrove_unit_</w:t>
+            </w:r>
+            <w:proofErr w:type="gramStart"/>
+            <w:r>
+              <w:rPr>
+                <w:szCs w:val="20"/>
+              </w:rPr>
+              <w:t>converter.temperature</w:t>
+            </w:r>
+            <w:proofErr w:type="spellEnd"/>
+            <w:proofErr w:type="gramEnd"/>
+            <w:r>
+              <w:rPr>
+                <w:szCs w:val="20"/>
+              </w:rPr>
+              <w:t xml:space="preserve"> import </w:t>
+            </w:r>
+            <w:proofErr w:type="spellStart"/>
+            <w:r>
+              <w:rPr>
+                <w:szCs w:val="20"/>
+              </w:rPr>
+              <w:t>apparent_temperature</w:t>
+            </w:r>
+            <w:proofErr w:type="spellEnd"/>
+          </w:p>
+          <w:p>
+            <w:pPr>
+              <w:rPr>
+                <w:szCs w:val="20"/>
+              </w:rPr>
+            </w:pPr>
+            <w:r>
+              <w:rPr>
+                <w:szCs w:val="20"/>
+              </w:rPr>
+              <w:t xml:space="preserve">&gt;&gt;&gt; </w:t>
+            </w:r>
+            <w:proofErr w:type="spellStart"/>
+            <w:r>
+              <w:rPr>
+                <w:szCs w:val="20"/>
+              </w:rPr>
+              <w:t>apparent_</w:t>
+            </w:r>
+            <w:proofErr w:type="gramStart"/>
+            <w:r>
+              <w:rPr>
+                <w:szCs w:val="20"/>
+              </w:rPr>
+              <w:t>temperature</w:t>
+            </w:r>
+            <w:proofErr w:type="spellEnd"/>
+            <w:r>
+              <w:rPr>
+                <w:szCs w:val="20"/>
+              </w:rPr>
+              <w:t>(</w:t>
+            </w:r>
+            <w:proofErr w:type="spellStart"/>
+            <w:proofErr w:type="gramEnd"/>
+            <w:r>
+              <w:rPr>
+                <w:szCs w:val="20"/>
+              </w:rPr>
+              <w:t>tt</w:t>
+            </w:r>
+            <w:proofErr w:type="spellEnd"/>
+            <w:r>
+              <w:rPr>
+                <w:szCs w:val="20"/>
+              </w:rPr>
+              <w:t xml:space="preserve">, </w:t>
+            </w:r>
+            <w:proofErr w:type="spellStart"/>
+            <w:r>
+              <w:rPr>
+                <w:szCs w:val="20"/>
+              </w:rPr>
+              <w:t>hh</w:t>
+            </w:r>
+            <w:proofErr w:type="spellEnd"/>
+            <w:r>
+              <w:rPr>
+                <w:szCs w:val="20"/>
+              </w:rPr>
+              <w:t xml:space="preserve">, </w:t>
+            </w:r>
+            <w:proofErr w:type="spellStart"/>
+            <w:r>
+              <w:rPr>
+                <w:szCs w:val="20"/>
+              </w:rPr>
+              <w:t>ww</w:t>
+            </w:r>
+            <w:proofErr w:type="spellEnd"/>
+            <w:r>
+              <w:rPr>
+                <w:szCs w:val="20"/>
+              </w:rPr>
+              <w:t>)  # Apparent Temperature Converter (_under development_)</w:t>
+            </w:r>
+          </w:p>
+          <w:p>
+            <w:pPr>
+              <w:rPr>
+                <w:szCs w:val="20"/>
+              </w:rPr>
+            </w:pPr>
+            <w:proofErr w:type="spellStart"/>
+            <w:r>
+              <w:rPr>
+                <w:szCs w:val="20"/>
+              </w:rPr>
+              <w:t>atatatatat</w:t>
+            </w:r>
+            <w:proofErr w:type="spellEnd"/>
+          </w:p>
+          <w:p>
+            <w:pPr>
+              <w:rPr>
+                <w:rFonts w:ascii="Courier New" w:hAnsi="Courier New" w:cs="Courier New"/>
+                <w:sz w:val="18"/>
+                <w:szCs w:val="18"/>
+              </w:rPr>
+            </w:pPr>
+          </w:p>
+        </w:tc>
+      </w:tr>
+    </w:tbl>
+    <w:p>
+      <w:pPr>
+        <w:rPr>
+          <w:szCs w:val="20"/>
+          <w:lang w:val="en"/>
+        </w:rPr>
+      </w:pPr>
+    </w:p>
     <w:p>
       <w:pPr>
         <w:rPr>
@@ -4739,7 +6747,6 @@
   <w:style w:type="character" w:default="1" w:styleId="DefaultParagraphFont">
     <w:name w:val="Default Paragraph Font"/>
     <w:uiPriority w:val="1"/>
-    <w:semiHidden/>
     <w:unhideWhenUsed/>
   </w:style>
   <w:style w:type="table" w:default="1" w:styleId="TableNormal">

</xml_diff>